<commit_message>
Recut raise docs LLC -> Delaware C-corp; isolate Norman's Class B super-vote
- Correct entity to C-corp per the A&R Certificate of Incorporation.
- Investors + other founders get Class A Common (1 vote); Norman alone holds
  Class B (10 votes); charter auto-conversion prevents anyone else holding it.
- Replace Operating Agreement with a Stockholders' Agreement; Subscription ->
  Stock Purchase Agreement (shares).
- Flag the real gap: revenue-share preference can't live in equal-rights common
  stock -> needs a separate Revenue-Share Agreement or a Series Seed Preferred.
- Regenerate Word versions.

Co-Authored-By: Claude Opus 4.8 <noreply@anthropic.com>
Claude-Session: https://claude.ai/code/session_019ajJRqKa1DUy4iKHJKPEi3
</commit_message>
<xml_diff>
--- a/cinderella/legal/Making_Cinderella_Term_Sheet.docx
+++ b/cinderella/legal/Making_Cinderella_Term_Sheet.docx
@@ -33,7 +33,7 @@
           <w:sz w:val="22"/>
           <w:szCs w:val="22"/>
         </w:rPr>
-        <w:t xml:space="preserve">Prepared 2026-08-15 as an internal working draft for Norman to review with counsel (Loeb &amp; Loeb — Brian Socolow) and Sunjay before any use. Nothing here is an offer to sell securities. Any offering must comply with federal/state securities law (Reg D). Bracketed items </w:t>
+        <w:t xml:space="preserve">Working draft, 2026-08-15. Review with Loeb &amp; Loeb (Brian Socolow) and Sunjay before any use. Not an offer to sell securities. Bracketed items </w:t>
       </w:r>
       <w:r>
         <w:rPr>
@@ -57,7 +57,31 @@
           <w:sz w:val="22"/>
           <w:szCs w:val="22"/>
         </w:rPr>
-        <w:t xml:space="preserve"> need confirmation._</w:t>
+        <w:t xml:space="preserve"> need confirmation. </w:t>
+      </w:r>
+      <w:r>
+        <w:rPr>
+          <w:rFonts w:ascii="Times New Roman" w:cs="Times New Roman" w:eastAsia="Times New Roman" w:hAnsi="Times New Roman"/>
+          <w:b/>
+          <w:bCs/>
+          <w:i/>
+          <w:iCs/>
+          <w:sz w:val="22"/>
+          <w:szCs w:val="22"/>
+        </w:rPr>
+        <w:t xml:space="preserve">Entity corrected to a Delaware C-corporation</w:t>
+      </w:r>
+      <w:r>
+        <w:rPr>
+          <w:rFonts w:ascii="Times New Roman" w:cs="Times New Roman" w:eastAsia="Times New Roman" w:hAnsi="Times New Roman"/>
+          <w:b w:val="false"/>
+          <w:bCs w:val="false"/>
+          <w:i/>
+          <w:iCs/>
+          <w:sz w:val="22"/>
+          <w:szCs w:val="22"/>
+        </w:rPr>
+        <w:t xml:space="preserve"> per the Amended &amp; Restated Certificate of Incorporation._</w:t>
       </w:r>
     </w:p>
     <w:p>
@@ -83,7 +107,7 @@
           <w:sz w:val="22"/>
           <w:szCs w:val="22"/>
         </w:rPr>
-        <w:t xml:space="preserve">Cinderella Corp LLC — Seed Round Summary of Principal Terms</w:t>
+        <w:t xml:space="preserve">Cinderella Corp. — Seed Round Summary of Principal Terms</w:t>
       </w:r>
     </w:p>
     <w:p>
@@ -208,14 +232,50 @@
             <w:r>
               <w:rPr>
                 <w:rFonts w:ascii="Times New Roman" w:cs="Times New Roman" w:eastAsia="Times New Roman" w:hAnsi="Times New Roman"/>
-                <w:b w:val="false"/>
-                <w:bCs w:val="false"/>
-                <w:i w:val="false"/>
-                <w:iCs w:val="false"/>
-                <w:sz w:val="22"/>
-                <w:szCs w:val="22"/>
-              </w:rPr>
-              <w:t xml:space="preserve">Cinderella Corp LLC, a Delaware limited liability company (the "</w:t>
+                <w:b/>
+                <w:bCs/>
+                <w:i w:val="false"/>
+                <w:iCs w:val="false"/>
+                <w:sz w:val="22"/>
+                <w:szCs w:val="22"/>
+              </w:rPr>
+              <w:t xml:space="preserve">Cinderella Corp.</w:t>
+            </w:r>
+            <w:r>
+              <w:rPr>
+                <w:rFonts w:ascii="Times New Roman" w:cs="Times New Roman" w:eastAsia="Times New Roman" w:hAnsi="Times New Roman"/>
+                <w:b w:val="false"/>
+                <w:bCs w:val="false"/>
+                <w:i w:val="false"/>
+                <w:iCs w:val="false"/>
+                <w:sz w:val="22"/>
+                <w:szCs w:val="22"/>
+              </w:rPr>
+              <w:t xml:space="preserve">, a Delaware </w:t>
+            </w:r>
+            <w:r>
+              <w:rPr>
+                <w:rFonts w:ascii="Times New Roman" w:cs="Times New Roman" w:eastAsia="Times New Roman" w:hAnsi="Times New Roman"/>
+                <w:b/>
+                <w:bCs/>
+                <w:i w:val="false"/>
+                <w:iCs w:val="false"/>
+                <w:sz w:val="22"/>
+                <w:szCs w:val="22"/>
+              </w:rPr>
+              <w:t xml:space="preserve">corporation</w:t>
+            </w:r>
+            <w:r>
+              <w:rPr>
+                <w:rFonts w:ascii="Times New Roman" w:cs="Times New Roman" w:eastAsia="Times New Roman" w:hAnsi="Times New Roman"/>
+                <w:b w:val="false"/>
+                <w:bCs w:val="false"/>
+                <w:i w:val="false"/>
+                <w:iCs w:val="false"/>
+                <w:sz w:val="22"/>
+                <w:szCs w:val="22"/>
+              </w:rPr>
+              <w:t xml:space="preserve"> (the "</w:t>
             </w:r>
             <w:r>
               <w:rPr>
@@ -239,19 +299,7 @@
                 <w:sz w:val="22"/>
                 <w:szCs w:val="22"/>
               </w:rPr>
-              <w:t xml:space="preserve">"). </w:t>
-            </w:r>
-            <w:r>
-              <w:rPr>
-                <w:rFonts w:ascii="Times New Roman" w:cs="Times New Roman" w:eastAsia="Times New Roman" w:hAnsi="Times New Roman"/>
-                <w:b/>
-                <w:bCs/>
-                <w:i w:val="false"/>
-                <w:iCs w:val="false"/>
-                <w:sz w:val="22"/>
-                <w:szCs w:val="22"/>
-              </w:rPr>
-              <w:t xml:space="preserve">[Confirm exact registered legal name + that formation is in Delaware — the "Corp" in the brand name should be reconciled with LLC status.]</w:t>
+              <w:t xml:space="preserve">"). Charter: A&amp;R Certificate of Incorporation (replacing the Cert. filed April 13, 2026).</w:t>
             </w:r>
           </w:p>
         </w:tc>
@@ -302,38 +350,50 @@
             <w:r>
               <w:rPr>
                 <w:rFonts w:ascii="Times New Roman" w:cs="Times New Roman" w:eastAsia="Times New Roman" w:hAnsi="Times New Roman"/>
-                <w:b w:val="false"/>
-                <w:bCs w:val="false"/>
-                <w:i w:val="false"/>
-                <w:iCs w:val="false"/>
-                <w:sz w:val="22"/>
-                <w:szCs w:val="22"/>
-              </w:rPr>
-              <w:t xml:space="preserve">Newly issued </w:t>
-            </w:r>
-            <w:r>
-              <w:rPr>
-                <w:rFonts w:ascii="Times New Roman" w:cs="Times New Roman" w:eastAsia="Times New Roman" w:hAnsi="Times New Roman"/>
-                <w:b/>
-                <w:bCs/>
-                <w:i w:val="false"/>
-                <w:iCs w:val="false"/>
-                <w:sz w:val="22"/>
-                <w:szCs w:val="22"/>
-              </w:rPr>
-              <w:t xml:space="preserve">Class A Units</w:t>
-            </w:r>
-            <w:r>
-              <w:rPr>
-                <w:rFonts w:ascii="Times New Roman" w:cs="Times New Roman" w:eastAsia="Times New Roman" w:hAnsi="Times New Roman"/>
-                <w:b w:val="false"/>
-                <w:bCs w:val="false"/>
-                <w:i w:val="false"/>
-                <w:iCs w:val="false"/>
-                <w:sz w:val="22"/>
-                <w:szCs w:val="22"/>
-              </w:rPr>
-              <w:t xml:space="preserve"> (membership interests) — a priced equity round (not a SAFE or note).</w:t>
+                <w:b/>
+                <w:bCs/>
+                <w:i w:val="false"/>
+                <w:iCs w:val="false"/>
+                <w:sz w:val="22"/>
+                <w:szCs w:val="22"/>
+              </w:rPr>
+              <w:t xml:space="preserve">Class A Common Stock</w:t>
+            </w:r>
+            <w:r>
+              <w:rPr>
+                <w:rFonts w:ascii="Times New Roman" w:cs="Times New Roman" w:eastAsia="Times New Roman" w:hAnsi="Times New Roman"/>
+                <w:b w:val="false"/>
+                <w:bCs w:val="false"/>
+                <w:i w:val="false"/>
+                <w:iCs w:val="false"/>
+                <w:sz w:val="22"/>
+                <w:szCs w:val="22"/>
+              </w:rPr>
+              <w:t xml:space="preserve"> (1 vote/share) — </w:t>
+            </w:r>
+            <w:r>
+              <w:rPr>
+                <w:rFonts w:ascii="Times New Roman" w:cs="Times New Roman" w:eastAsia="Times New Roman" w:hAnsi="Times New Roman"/>
+                <w:b/>
+                <w:bCs/>
+                <w:i w:val="false"/>
+                <w:iCs w:val="false"/>
+                <w:sz w:val="22"/>
+                <w:szCs w:val="22"/>
+              </w:rPr>
+              <w:t xml:space="preserve">[plus a Revenue-Share Right; see economics + note].</w:t>
+            </w:r>
+            <w:r>
+              <w:rPr>
+                <w:rFonts w:ascii="Times New Roman" w:cs="Times New Roman" w:eastAsia="Times New Roman" w:hAnsi="Times New Roman"/>
+                <w:b w:val="false"/>
+                <w:bCs w:val="false"/>
+                <w:i w:val="false"/>
+                <w:iCs w:val="false"/>
+                <w:sz w:val="22"/>
+                <w:szCs w:val="22"/>
+              </w:rPr>
+              <w:t xml:space="preserve"> Priced equity round.</w:t>
             </w:r>
           </w:p>
         </w:tc>
@@ -415,7 +475,7 @@
                 <w:sz w:val="22"/>
                 <w:szCs w:val="22"/>
               </w:rPr>
-              <w:t xml:space="preserve">[Plan contemplates an additional $1,500,000 callable on the same terms thereafter — confirm the second call's valuation/dilution mechanics (another 15%? at what post-money?).]</w:t>
+              <w:t xml:space="preserve">[Plan contemplates an additional $1,500,000 callable on same terms — confirm second-tranche valuation/dilution. Consider a smaller first close with the rest callable, to retain equity if undeployed — see the tranching discussion.]</w:t>
             </w:r>
           </w:p>
         </w:tc>
@@ -536,14 +596,26 @@
             <w:r>
               <w:rPr>
                 <w:rFonts w:ascii="Times New Roman" w:cs="Times New Roman" w:eastAsia="Times New Roman" w:hAnsi="Times New Roman"/>
-                <w:b/>
-                <w:bCs/>
-                <w:i w:val="false"/>
-                <w:iCs w:val="false"/>
-                <w:sz w:val="22"/>
-                <w:szCs w:val="22"/>
-              </w:rPr>
-              <w:t xml:space="preserve">$100,000 per Unit</w:t>
+                <w:b w:val="false"/>
+                <w:bCs w:val="false"/>
+                <w:i w:val="false"/>
+                <w:iCs w:val="false"/>
+                <w:sz w:val="22"/>
+                <w:szCs w:val="22"/>
+              </w:rPr>
+              <w:t xml:space="preserve">Priced so </w:t>
+            </w:r>
+            <w:r>
+              <w:rPr>
+                <w:rFonts w:ascii="Times New Roman" w:cs="Times New Roman" w:eastAsia="Times New Roman" w:hAnsi="Times New Roman"/>
+                <w:b/>
+                <w:bCs/>
+                <w:i w:val="false"/>
+                <w:iCs w:val="false"/>
+                <w:sz w:val="22"/>
+                <w:szCs w:val="22"/>
+              </w:rPr>
+              <w:t xml:space="preserve">$100,000 = 1.0% of the Company</w:t>
             </w:r>
             <w:r>
               <w:rPr>
@@ -567,43 +639,79 @@
                 <w:sz w:val="22"/>
                 <w:szCs w:val="22"/>
               </w:rPr>
-              <w:t xml:space="preserve">1 Unit = 1.0% of the Company</w:t>
-            </w:r>
-            <w:r>
-              <w:rPr>
-                <w:rFonts w:ascii="Times New Roman" w:cs="Times New Roman" w:eastAsia="Times New Roman" w:hAnsi="Times New Roman"/>
-                <w:b w:val="false"/>
-                <w:bCs w:val="false"/>
-                <w:i w:val="false"/>
-                <w:iCs w:val="false"/>
-                <w:sz w:val="22"/>
-                <w:szCs w:val="22"/>
-              </w:rPr>
-              <w:t xml:space="preserve">; </w:t>
-            </w:r>
-            <w:r>
-              <w:rPr>
-                <w:rFonts w:ascii="Times New Roman" w:cs="Times New Roman" w:eastAsia="Times New Roman" w:hAnsi="Times New Roman"/>
-                <w:b/>
-                <w:bCs/>
-                <w:i w:val="false"/>
-                <w:iCs w:val="false"/>
-                <w:sz w:val="22"/>
-                <w:szCs w:val="22"/>
-              </w:rPr>
-              <w:t xml:space="preserve">15 Units</w:t>
-            </w:r>
-            <w:r>
-              <w:rPr>
-                <w:rFonts w:ascii="Times New Roman" w:cs="Times New Roman" w:eastAsia="Times New Roman" w:hAnsi="Times New Roman"/>
-                <w:b w:val="false"/>
-                <w:bCs w:val="false"/>
-                <w:i w:val="false"/>
-                <w:iCs w:val="false"/>
-                <w:sz w:val="22"/>
-                <w:szCs w:val="22"/>
-              </w:rPr>
-              <w:t xml:space="preserve"> offered (= 15% in aggregate). Target 15 investors at 1 Unit each (concentration/rounding at Manager's discretion).</w:t>
+              <w:t xml:space="preserve">15% in aggregate</w:t>
+            </w:r>
+            <w:r>
+              <w:rPr>
+                <w:rFonts w:ascii="Times New Roman" w:cs="Times New Roman" w:eastAsia="Times New Roman" w:hAnsi="Times New Roman"/>
+                <w:b w:val="false"/>
+                <w:bCs w:val="false"/>
+                <w:i w:val="false"/>
+                <w:iCs w:val="false"/>
+                <w:sz w:val="22"/>
+                <w:szCs w:val="22"/>
+              </w:rPr>
+              <w:t xml:space="preserve"> to investors, as </w:t>
+            </w:r>
+            <w:r>
+              <w:rPr>
+                <w:rFonts w:ascii="Times New Roman" w:cs="Times New Roman" w:eastAsia="Times New Roman" w:hAnsi="Times New Roman"/>
+                <w:b/>
+                <w:bCs/>
+                <w:i w:val="false"/>
+                <w:iCs w:val="false"/>
+                <w:sz w:val="22"/>
+                <w:szCs w:val="22"/>
+              </w:rPr>
+              <w:t xml:space="preserve">[_</w:t>
+            </w:r>
+            <w:r>
+              <w:rPr>
+                <w:rFonts w:ascii="Times New Roman" w:cs="Times New Roman" w:eastAsia="Times New Roman" w:hAnsi="Times New Roman"/>
+                <w:b/>
+                <w:bCs/>
+                <w:i/>
+                <w:iCs/>
+                <w:sz w:val="22"/>
+                <w:szCs w:val="22"/>
+              </w:rPr>
+              <w:t xml:space="preserve">] shares of Class A Common</w:t>
+            </w:r>
+            <w:r>
+              <w:rPr>
+                <w:rFonts w:ascii="Times New Roman" w:cs="Times New Roman" w:eastAsia="Times New Roman" w:hAnsi="Times New Roman"/>
+                <w:b w:val="false"/>
+                <w:bCs w:val="false"/>
+                <w:i/>
+                <w:iCs/>
+                <w:sz w:val="22"/>
+                <w:szCs w:val="22"/>
+              </w:rPr>
+              <w:t xml:space="preserve"> at </w:t>
+            </w:r>
+            <w:r>
+              <w:rPr>
+                <w:rFonts w:ascii="Times New Roman" w:cs="Times New Roman" w:eastAsia="Times New Roman" w:hAnsi="Times New Roman"/>
+                <w:b/>
+                <w:bCs/>
+                <w:i/>
+                <w:iCs/>
+                <w:sz w:val="22"/>
+                <w:szCs w:val="22"/>
+              </w:rPr>
+              <w:t xml:space="preserve">$[__]/share [compute from the authorized 15,000,000 Class A shares]</w:t>
+            </w:r>
+            <w:r>
+              <w:rPr>
+                <w:rFonts w:ascii="Times New Roman" w:cs="Times New Roman" w:eastAsia="Times New Roman" w:hAnsi="Times New Roman"/>
+                <w:b w:val="false"/>
+                <w:bCs w:val="false"/>
+                <w:i/>
+                <w:iCs/>
+                <w:sz w:val="22"/>
+                <w:szCs w:val="22"/>
+              </w:rPr>
+              <w:t xml:space="preserve">. Target 15 investors at $100,000 each.</w:t>
             </w:r>
           </w:p>
         </w:tc>
@@ -661,19 +769,19 @@
                 <w:sz w:val="22"/>
                 <w:szCs w:val="22"/>
               </w:rPr>
-              <w:t xml:space="preserve">Single close targeted September 15, 2026</w:t>
-            </w:r>
-            <w:r>
-              <w:rPr>
-                <w:rFonts w:ascii="Times New Roman" w:cs="Times New Roman" w:eastAsia="Times New Roman" w:hAnsi="Times New Roman"/>
-                <w:b w:val="false"/>
-                <w:bCs w:val="false"/>
-                <w:i w:val="false"/>
-                <w:iCs w:val="false"/>
-                <w:sz w:val="22"/>
-                <w:szCs w:val="22"/>
-              </w:rPr>
-              <w:t xml:space="preserve">, with subscription docs and the Operating Agreement executed at that time. Capital deployed from close through </w:t>
+              <w:t xml:space="preserve">Single close targeted September 15, 2026.</w:t>
+            </w:r>
+            <w:r>
+              <w:rPr>
+                <w:rFonts w:ascii="Times New Roman" w:cs="Times New Roman" w:eastAsia="Times New Roman" w:hAnsi="Times New Roman"/>
+                <w:b w:val="false"/>
+                <w:bCs w:val="false"/>
+                <w:i w:val="false"/>
+                <w:iCs w:val="false"/>
+                <w:sz w:val="22"/>
+                <w:szCs w:val="22"/>
+              </w:rPr>
+              <w:t xml:space="preserve"> Capital deployed from close through </w:t>
             </w:r>
             <w:r>
               <w:rPr>
@@ -697,7 +805,7 @@
                 <w:sz w:val="22"/>
                 <w:szCs w:val="22"/>
               </w:rPr>
-              <w:t xml:space="preserve"> (balance held in reserve).</w:t>
+              <w:t xml:space="preserve">; balance held in reserve.</w:t>
             </w:r>
           </w:p>
         </w:tc>
@@ -727,7 +835,7 @@
                 <w:sz w:val="22"/>
                 <w:szCs w:val="22"/>
               </w:rPr>
-              <w:t xml:space="preserve">Post-raise cap table</w:t>
+              <w:t xml:space="preserve">Capital structure (control)</w:t>
             </w:r>
           </w:p>
         </w:tc>
@@ -755,67 +863,127 @@
                 <w:sz w:val="22"/>
                 <w:szCs w:val="22"/>
               </w:rPr>
-              <w:t xml:space="preserve">Class A (Investors): </w:t>
-            </w:r>
-            <w:r>
-              <w:rPr>
-                <w:rFonts w:ascii="Times New Roman" w:cs="Times New Roman" w:eastAsia="Times New Roman" w:hAnsi="Times New Roman"/>
-                <w:b/>
-                <w:bCs/>
-                <w:i w:val="false"/>
-                <w:iCs w:val="false"/>
-                <w:sz w:val="22"/>
-                <w:szCs w:val="22"/>
-              </w:rPr>
-              <w:t xml:space="preserve">15%</w:t>
-            </w:r>
-            <w:r>
-              <w:rPr>
-                <w:rFonts w:ascii="Times New Roman" w:cs="Times New Roman" w:eastAsia="Times New Roman" w:hAnsi="Times New Roman"/>
-                <w:b w:val="false"/>
-                <w:bCs w:val="false"/>
-                <w:i w:val="false"/>
-                <w:iCs w:val="false"/>
-                <w:sz w:val="22"/>
-                <w:szCs w:val="22"/>
-              </w:rPr>
-              <w:t xml:space="preserve">. Class B (Founders — Norman, Sunjay, Ankur, Greg, others per existing arrangements): </w:t>
-            </w:r>
-            <w:r>
-              <w:rPr>
-                <w:rFonts w:ascii="Times New Roman" w:cs="Times New Roman" w:eastAsia="Times New Roman" w:hAnsi="Times New Roman"/>
-                <w:b/>
-                <w:bCs/>
-                <w:i w:val="false"/>
-                <w:iCs w:val="false"/>
-                <w:sz w:val="22"/>
-                <w:szCs w:val="22"/>
-              </w:rPr>
-              <w:t xml:space="preserve">85%</w:t>
-            </w:r>
-            <w:r>
-              <w:rPr>
-                <w:rFonts w:ascii="Times New Roman" w:cs="Times New Roman" w:eastAsia="Times New Roman" w:hAnsi="Times New Roman"/>
-                <w:b w:val="false"/>
-                <w:bCs w:val="false"/>
-                <w:i w:val="false"/>
-                <w:iCs w:val="false"/>
-                <w:sz w:val="22"/>
-                <w:szCs w:val="22"/>
-              </w:rPr>
-              <w:t xml:space="preserve">. </w:t>
-            </w:r>
-            <w:r>
-              <w:rPr>
-                <w:rFonts w:ascii="Times New Roman" w:cs="Times New Roman" w:eastAsia="Times New Roman" w:hAnsi="Times New Roman"/>
-                <w:b/>
-                <w:bCs/>
-                <w:i w:val="false"/>
-                <w:iCs w:val="false"/>
-                <w:sz w:val="22"/>
-                <w:szCs w:val="22"/>
-              </w:rPr>
-              <w:t xml:space="preserve">[Confirm founder split — governed separately from this round.]</w:t>
+              <w:t xml:space="preserve">Two classes of common: </w:t>
+            </w:r>
+            <w:r>
+              <w:rPr>
+                <w:rFonts w:ascii="Times New Roman" w:cs="Times New Roman" w:eastAsia="Times New Roman" w:hAnsi="Times New Roman"/>
+                <w:b/>
+                <w:bCs/>
+                <w:i w:val="false"/>
+                <w:iCs w:val="false"/>
+                <w:sz w:val="22"/>
+                <w:szCs w:val="22"/>
+              </w:rPr>
+              <w:t xml:space="preserve">Class A Common — 1 vote/share</w:t>
+            </w:r>
+            <w:r>
+              <w:rPr>
+                <w:rFonts w:ascii="Times New Roman" w:cs="Times New Roman" w:eastAsia="Times New Roman" w:hAnsi="Times New Roman"/>
+                <w:b w:val="false"/>
+                <w:bCs w:val="false"/>
+                <w:i w:val="false"/>
+                <w:iCs w:val="false"/>
+                <w:sz w:val="22"/>
+                <w:szCs w:val="22"/>
+              </w:rPr>
+              <w:t xml:space="preserve"> and </w:t>
+            </w:r>
+            <w:r>
+              <w:rPr>
+                <w:rFonts w:ascii="Times New Roman" w:cs="Times New Roman" w:eastAsia="Times New Roman" w:hAnsi="Times New Roman"/>
+                <w:b/>
+                <w:bCs/>
+                <w:i w:val="false"/>
+                <w:iCs w:val="false"/>
+                <w:sz w:val="22"/>
+                <w:szCs w:val="22"/>
+              </w:rPr>
+              <w:t xml:space="preserve">Class B Common — 10 votes/share.</w:t>
+            </w:r>
+            <w:r>
+              <w:rPr>
+                <w:rFonts w:ascii="Times New Roman" w:cs="Times New Roman" w:eastAsia="Times New Roman" w:hAnsi="Times New Roman"/>
+                <w:b w:val="false"/>
+                <w:bCs w:val="false"/>
+                <w:i w:val="false"/>
+                <w:iCs w:val="false"/>
+                <w:sz w:val="22"/>
+                <w:szCs w:val="22"/>
+              </w:rPr>
+              <w:t xml:space="preserve"> </w:t>
+            </w:r>
+            <w:r>
+              <w:rPr>
+                <w:rFonts w:ascii="Times New Roman" w:cs="Times New Roman" w:eastAsia="Times New Roman" w:hAnsi="Times New Roman"/>
+                <w:b/>
+                <w:bCs/>
+                <w:i w:val="false"/>
+                <w:iCs w:val="false"/>
+                <w:sz w:val="22"/>
+                <w:szCs w:val="22"/>
+              </w:rPr>
+              <w:t xml:space="preserve">Norman C. de Silva is the sole holder of Class B</w:t>
+            </w:r>
+            <w:r>
+              <w:rPr>
+                <w:rFonts w:ascii="Times New Roman" w:cs="Times New Roman" w:eastAsia="Times New Roman" w:hAnsi="Times New Roman"/>
+                <w:b w:val="false"/>
+                <w:bCs w:val="false"/>
+                <w:i w:val="false"/>
+                <w:iCs w:val="false"/>
+                <w:sz w:val="22"/>
+                <w:szCs w:val="22"/>
+              </w:rPr>
+              <w:t xml:space="preserve"> (super-voting control). </w:t>
+            </w:r>
+            <w:r>
+              <w:rPr>
+                <w:rFonts w:ascii="Times New Roman" w:cs="Times New Roman" w:eastAsia="Times New Roman" w:hAnsi="Times New Roman"/>
+                <w:b/>
+                <w:bCs/>
+                <w:i w:val="false"/>
+                <w:iCs w:val="false"/>
+                <w:sz w:val="22"/>
+                <w:szCs w:val="22"/>
+              </w:rPr>
+              <w:t xml:space="preserve">All other holders — Ankur, Sunjay, Greg, and ALL investors — hold Class A Common (1 vote).</w:t>
+            </w:r>
+            <w:r>
+              <w:rPr>
+                <w:rFonts w:ascii="Times New Roman" w:cs="Times New Roman" w:eastAsia="Times New Roman" w:hAnsi="Times New Roman"/>
+                <w:b w:val="false"/>
+                <w:bCs w:val="false"/>
+                <w:i w:val="false"/>
+                <w:iCs w:val="false"/>
+                <w:sz w:val="22"/>
+                <w:szCs w:val="22"/>
+              </w:rPr>
+              <w:t xml:space="preserve"> Class B </w:t>
+            </w:r>
+            <w:r>
+              <w:rPr>
+                <w:rFonts w:ascii="Times New Roman" w:cs="Times New Roman" w:eastAsia="Times New Roman" w:hAnsi="Times New Roman"/>
+                <w:b/>
+                <w:bCs/>
+                <w:i w:val="false"/>
+                <w:iCs w:val="false"/>
+                <w:sz w:val="22"/>
+                <w:szCs w:val="22"/>
+              </w:rPr>
+              <w:t xml:space="preserve">auto-converts to Class A</w:t>
+            </w:r>
+            <w:r>
+              <w:rPr>
+                <w:rFonts w:ascii="Times New Roman" w:cs="Times New Roman" w:eastAsia="Times New Roman" w:hAnsi="Times New Roman"/>
+                <w:b w:val="false"/>
+                <w:bCs w:val="false"/>
+                <w:i w:val="false"/>
+                <w:iCs w:val="false"/>
+                <w:sz w:val="22"/>
+                <w:szCs w:val="22"/>
+              </w:rPr>
+              <w:t xml:space="preserve"> on any transfer other than a Permitted Transfer (Norman's estate/holding vehicle), so no one else can ever hold super-voting stock.</w:t>
             </w:r>
           </w:p>
         </w:tc>
@@ -845,7 +1013,7 @@
                 <w:sz w:val="22"/>
                 <w:szCs w:val="22"/>
               </w:rPr>
-              <w:t xml:space="preserve">Use of proceeds</w:t>
+              <w:t xml:space="preserve">Board</w:t>
             </w:r>
           </w:p>
         </w:tc>
@@ -866,14 +1034,62 @@
             <w:r>
               <w:rPr>
                 <w:rFonts w:ascii="Times New Roman" w:cs="Times New Roman" w:eastAsia="Times New Roman" w:hAnsi="Times New Roman"/>
-                <w:b w:val="false"/>
-                <w:bCs w:val="false"/>
-                <w:i w:val="false"/>
-                <w:iCs w:val="false"/>
-                <w:sz w:val="22"/>
-                <w:szCs w:val="22"/>
-              </w:rPr>
-              <w:t xml:space="preserve">Working capital for parent-co operations (legal, basketball ops, school/celebrity/sponsor procurement, team). Per the MANCO budget.</w:t>
+                <w:b/>
+                <w:bCs/>
+                <w:i w:val="false"/>
+                <w:iCs w:val="false"/>
+                <w:sz w:val="22"/>
+                <w:szCs w:val="22"/>
+              </w:rPr>
+              <w:t xml:space="preserve">[3] directors</w:t>
+            </w:r>
+            <w:r>
+              <w:rPr>
+                <w:rFonts w:ascii="Times New Roman" w:cs="Times New Roman" w:eastAsia="Times New Roman" w:hAnsi="Times New Roman"/>
+                <w:b w:val="false"/>
+                <w:bCs w:val="false"/>
+                <w:i w:val="false"/>
+                <w:iCs w:val="false"/>
+                <w:sz w:val="22"/>
+                <w:szCs w:val="22"/>
+              </w:rPr>
+              <w:t xml:space="preserve">, elected by stockholder vote — which Norman controls via the Class B super-vote. Investors receive </w:t>
+            </w:r>
+            <w:r>
+              <w:rPr>
+                <w:rFonts w:ascii="Times New Roman" w:cs="Times New Roman" w:eastAsia="Times New Roman" w:hAnsi="Times New Roman"/>
+                <w:b/>
+                <w:bCs/>
+                <w:i w:val="false"/>
+                <w:iCs w:val="false"/>
+                <w:sz w:val="22"/>
+                <w:szCs w:val="22"/>
+              </w:rPr>
+              <w:t xml:space="preserve">no board seat.</w:t>
+            </w:r>
+            <w:r>
+              <w:rPr>
+                <w:rFonts w:ascii="Times New Roman" w:cs="Times New Roman" w:eastAsia="Times New Roman" w:hAnsi="Times New Roman"/>
+                <w:b w:val="false"/>
+                <w:bCs w:val="false"/>
+                <w:i w:val="false"/>
+                <w:iCs w:val="false"/>
+                <w:sz w:val="22"/>
+                <w:szCs w:val="22"/>
+              </w:rPr>
+              <w:t xml:space="preserve"> </w:t>
+            </w:r>
+            <w:r>
+              <w:rPr>
+                <w:rFonts w:ascii="Times New Roman" w:cs="Times New Roman" w:eastAsia="Times New Roman" w:hAnsi="Times New Roman"/>
+                <w:b/>
+                <w:bCs/>
+                <w:i w:val="false"/>
+                <w:iCs w:val="false"/>
+                <w:sz w:val="22"/>
+                <w:szCs w:val="22"/>
+              </w:rPr>
+              <w:t xml:space="preserve">[Board size/composition to be set in Bylaws.]</w:t>
             </w:r>
           </w:p>
         </w:tc>
@@ -903,7 +1119,7 @@
                 <w:sz w:val="22"/>
                 <w:szCs w:val="22"/>
               </w:rPr>
-              <w:t xml:space="preserve">Management / control</w:t>
+              <w:t xml:space="preserve">Investor economics</w:t>
             </w:r>
           </w:p>
         </w:tc>
@@ -924,14 +1140,26 @@
             <w:r>
               <w:rPr>
                 <w:rFonts w:ascii="Times New Roman" w:cs="Times New Roman" w:eastAsia="Times New Roman" w:hAnsi="Times New Roman"/>
-                <w:b/>
-                <w:bCs/>
-                <w:i w:val="false"/>
-                <w:iCs w:val="false"/>
-                <w:sz w:val="22"/>
-                <w:szCs w:val="22"/>
-              </w:rPr>
-              <w:t xml:space="preserve">Manager-managed.</w:t>
+                <w:b w:val="false"/>
+                <w:bCs w:val="false"/>
+                <w:i w:val="false"/>
+                <w:iCs w:val="false"/>
+                <w:sz w:val="22"/>
+                <w:szCs w:val="22"/>
+              </w:rPr>
+              <w:t xml:space="preserve">Per the one-pager (additive): </w:t>
+            </w:r>
+            <w:r>
+              <w:rPr>
+                <w:rFonts w:ascii="Times New Roman" w:cs="Times New Roman" w:eastAsia="Times New Roman" w:hAnsi="Times New Roman"/>
+                <w:b/>
+                <w:bCs/>
+                <w:i w:val="false"/>
+                <w:iCs w:val="false"/>
+                <w:sz w:val="22"/>
+                <w:szCs w:val="22"/>
+              </w:rPr>
+              <w:t xml:space="preserve">(1) 15% Class A Common equity (permanent, pro-rata dividends/liquidation);</w:t>
             </w:r>
             <w:r>
               <w:rPr>
@@ -955,79 +1183,187 @@
                 <w:sz w:val="22"/>
                 <w:szCs w:val="22"/>
               </w:rPr>
-              <w:t xml:space="preserve">Norman C. de Silva</w:t>
-            </w:r>
-            <w:r>
-              <w:rPr>
-                <w:rFonts w:ascii="Times New Roman" w:cs="Times New Roman" w:eastAsia="Times New Roman" w:hAnsi="Times New Roman"/>
-                <w:b w:val="false"/>
-                <w:bCs w:val="false"/>
-                <w:i w:val="false"/>
-                <w:iCs w:val="false"/>
-                <w:sz w:val="22"/>
-                <w:szCs w:val="22"/>
-              </w:rPr>
-              <w:t xml:space="preserve"> is the sole </w:t>
-            </w:r>
-            <w:r>
-              <w:rPr>
-                <w:rFonts w:ascii="Times New Roman" w:cs="Times New Roman" w:eastAsia="Times New Roman" w:hAnsi="Times New Roman"/>
-                <w:b/>
-                <w:bCs/>
-                <w:i w:val="false"/>
-                <w:iCs w:val="false"/>
-                <w:sz w:val="22"/>
-                <w:szCs w:val="22"/>
-              </w:rPr>
-              <w:t xml:space="preserve">Manager</w:t>
-            </w:r>
-            <w:r>
-              <w:rPr>
-                <w:rFonts w:ascii="Times New Roman" w:cs="Times New Roman" w:eastAsia="Times New Roman" w:hAnsi="Times New Roman"/>
-                <w:b w:val="false"/>
-                <w:bCs w:val="false"/>
-                <w:i w:val="false"/>
-                <w:iCs w:val="false"/>
-                <w:sz w:val="22"/>
-                <w:szCs w:val="22"/>
-              </w:rPr>
-              <w:t xml:space="preserve"> and </w:t>
-            </w:r>
-            <w:r>
-              <w:rPr>
-                <w:rFonts w:ascii="Times New Roman" w:cs="Times New Roman" w:eastAsia="Times New Roman" w:hAnsi="Times New Roman"/>
-                <w:b/>
-                <w:bCs/>
-                <w:i w:val="false"/>
-                <w:iCs w:val="false"/>
-                <w:sz w:val="22"/>
-                <w:szCs w:val="22"/>
-              </w:rPr>
-              <w:t xml:space="preserve">Founder &amp; CEO</w:t>
-            </w:r>
-            <w:r>
-              <w:rPr>
-                <w:rFonts w:ascii="Times New Roman" w:cs="Times New Roman" w:eastAsia="Times New Roman" w:hAnsi="Times New Roman"/>
-                <w:b w:val="false"/>
-                <w:bCs w:val="false"/>
-                <w:i w:val="false"/>
-                <w:iCs w:val="false"/>
-                <w:sz w:val="22"/>
-                <w:szCs w:val="22"/>
-              </w:rPr>
-              <w:t xml:space="preserve">, with full authority over all Company decisions. Investors have </w:t>
-            </w:r>
-            <w:r>
-              <w:rPr>
-                <w:rFonts w:ascii="Times New Roman" w:cs="Times New Roman" w:eastAsia="Times New Roman" w:hAnsi="Times New Roman"/>
-                <w:b/>
-                <w:bCs/>
-                <w:i w:val="false"/>
-                <w:iCs w:val="false"/>
-                <w:sz w:val="22"/>
-                <w:szCs w:val="22"/>
-              </w:rPr>
-              <w:t xml:space="preserve">no voting rights and no board seat.</w:t>
+              <w:t xml:space="preserve">plus (2) a Revenue-Share Right</w:t>
+            </w:r>
+            <w:r>
+              <w:rPr>
+                <w:rFonts w:ascii="Times New Roman" w:cs="Times New Roman" w:eastAsia="Times New Roman" w:hAnsi="Times New Roman"/>
+                <w:b w:val="false"/>
+                <w:bCs w:val="false"/>
+                <w:i w:val="false"/>
+                <w:iCs w:val="false"/>
+                <w:sz w:val="22"/>
+                <w:szCs w:val="22"/>
+              </w:rPr>
+              <w:t xml:space="preserve"> — </w:t>
+            </w:r>
+            <w:r>
+              <w:rPr>
+                <w:rFonts w:ascii="Times New Roman" w:cs="Times New Roman" w:eastAsia="Times New Roman" w:hAnsi="Times New Roman"/>
+                <w:b/>
+                <w:bCs/>
+                <w:i w:val="false"/>
+                <w:iCs w:val="false"/>
+                <w:sz w:val="22"/>
+                <w:szCs w:val="22"/>
+              </w:rPr>
+              <w:t xml:space="preserve">50% of Company gross cash revenue collected</w:t>
+            </w:r>
+            <w:r>
+              <w:rPr>
+                <w:rFonts w:ascii="Times New Roman" w:cs="Times New Roman" w:eastAsia="Times New Roman" w:hAnsi="Times New Roman"/>
+                <w:b w:val="false"/>
+                <w:bCs w:val="false"/>
+                <w:i w:val="false"/>
+                <w:iCs w:val="false"/>
+                <w:sz w:val="22"/>
+                <w:szCs w:val="22"/>
+              </w:rPr>
+              <w:t xml:space="preserve"> until </w:t>
+            </w:r>
+            <w:r>
+              <w:rPr>
+                <w:rFonts w:ascii="Times New Roman" w:cs="Times New Roman" w:eastAsia="Times New Roman" w:hAnsi="Times New Roman"/>
+                <w:b/>
+                <w:bCs/>
+                <w:i w:val="false"/>
+                <w:iCs w:val="false"/>
+                <w:sz w:val="22"/>
+                <w:szCs w:val="22"/>
+              </w:rPr>
+              <w:t xml:space="preserve">1.0×</w:t>
+            </w:r>
+            <w:r>
+              <w:rPr>
+                <w:rFonts w:ascii="Times New Roman" w:cs="Times New Roman" w:eastAsia="Times New Roman" w:hAnsi="Times New Roman"/>
+                <w:b w:val="false"/>
+                <w:bCs w:val="false"/>
+                <w:i w:val="false"/>
+                <w:iCs w:val="false"/>
+                <w:sz w:val="22"/>
+                <w:szCs w:val="22"/>
+              </w:rPr>
+              <w:t xml:space="preserve"> ($1.5M), then </w:t>
+            </w:r>
+            <w:r>
+              <w:rPr>
+                <w:rFonts w:ascii="Times New Roman" w:cs="Times New Roman" w:eastAsia="Times New Roman" w:hAnsi="Times New Roman"/>
+                <w:b/>
+                <w:bCs/>
+                <w:i w:val="false"/>
+                <w:iCs w:val="false"/>
+                <w:sz w:val="22"/>
+                <w:szCs w:val="22"/>
+              </w:rPr>
+              <w:t xml:space="preserve">10%</w:t>
+            </w:r>
+            <w:r>
+              <w:rPr>
+                <w:rFonts w:ascii="Times New Roman" w:cs="Times New Roman" w:eastAsia="Times New Roman" w:hAnsi="Times New Roman"/>
+                <w:b w:val="false"/>
+                <w:bCs w:val="false"/>
+                <w:i w:val="false"/>
+                <w:iCs w:val="false"/>
+                <w:sz w:val="22"/>
+                <w:szCs w:val="22"/>
+              </w:rPr>
+              <w:t xml:space="preserve"> until </w:t>
+            </w:r>
+            <w:r>
+              <w:rPr>
+                <w:rFonts w:ascii="Times New Roman" w:cs="Times New Roman" w:eastAsia="Times New Roman" w:hAnsi="Times New Roman"/>
+                <w:b/>
+                <w:bCs/>
+                <w:i w:val="false"/>
+                <w:iCs w:val="false"/>
+                <w:sz w:val="22"/>
+                <w:szCs w:val="22"/>
+              </w:rPr>
+              <w:t xml:space="preserve">2.0×</w:t>
+            </w:r>
+            <w:r>
+              <w:rPr>
+                <w:rFonts w:ascii="Times New Roman" w:cs="Times New Roman" w:eastAsia="Times New Roman" w:hAnsi="Times New Roman"/>
+                <w:b w:val="false"/>
+                <w:bCs w:val="false"/>
+                <w:i w:val="false"/>
+                <w:iCs w:val="false"/>
+                <w:sz w:val="22"/>
+                <w:szCs w:val="22"/>
+              </w:rPr>
+              <w:t xml:space="preserve"> ($3.0M), then it </w:t>
+            </w:r>
+            <w:r>
+              <w:rPr>
+                <w:rFonts w:ascii="Times New Roman" w:cs="Times New Roman" w:eastAsia="Times New Roman" w:hAnsi="Times New Roman"/>
+                <w:b/>
+                <w:bCs/>
+                <w:i w:val="false"/>
+                <w:iCs w:val="false"/>
+                <w:sz w:val="22"/>
+                <w:szCs w:val="22"/>
+              </w:rPr>
+              <w:t xml:space="preserve">terminates.</w:t>
+            </w:r>
+            <w:r>
+              <w:rPr>
+                <w:rFonts w:ascii="Times New Roman" w:cs="Times New Roman" w:eastAsia="Times New Roman" w:hAnsi="Times New Roman"/>
+                <w:b w:val="false"/>
+                <w:bCs w:val="false"/>
+                <w:i w:val="false"/>
+                <w:iCs w:val="false"/>
+                <w:sz w:val="22"/>
+                <w:szCs w:val="22"/>
+              </w:rPr>
+              <w:t xml:space="preserve"> </w:t>
+            </w:r>
+            <w:r>
+              <w:rPr>
+                <w:rFonts w:ascii="Times New Roman" w:cs="Times New Roman" w:eastAsia="Times New Roman" w:hAnsi="Times New Roman"/>
+                <w:b/>
+                <w:bCs/>
+                <w:i w:val="false"/>
+                <w:iCs w:val="false"/>
+                <w:sz w:val="22"/>
+                <w:szCs w:val="22"/>
+              </w:rPr>
+              <w:t xml:space="preserve">[STRUCTURE — see note: common + separate Revenue-Share Agreement, OR a Series Seed Preferred.]</w:t>
+            </w:r>
+            <w:r>
+              <w:rPr>
+                <w:rFonts w:ascii="Times New Roman" w:cs="Times New Roman" w:eastAsia="Times New Roman" w:hAnsi="Times New Roman"/>
+                <w:b w:val="false"/>
+                <w:bCs w:val="false"/>
+                <w:i w:val="false"/>
+                <w:iCs w:val="false"/>
+                <w:sz w:val="22"/>
+                <w:szCs w:val="22"/>
+              </w:rPr>
+              <w:t xml:space="preserve"> Investor MOIC ≈ </w:t>
+            </w:r>
+            <w:r>
+              <w:rPr>
+                <w:rFonts w:ascii="Times New Roman" w:cs="Times New Roman" w:eastAsia="Times New Roman" w:hAnsi="Times New Roman"/>
+                <w:b/>
+                <w:bCs/>
+                <w:i w:val="false"/>
+                <w:iCs w:val="false"/>
+                <w:sz w:val="22"/>
+                <w:szCs w:val="22"/>
+              </w:rPr>
+              <w:t xml:space="preserve">13.47×</w:t>
+            </w:r>
+            <w:r>
+              <w:rPr>
+                <w:rFonts w:ascii="Times New Roman" w:cs="Times New Roman" w:eastAsia="Times New Roman" w:hAnsi="Times New Roman"/>
+                <w:b w:val="false"/>
+                <w:bCs w:val="false"/>
+                <w:i w:val="false"/>
+                <w:iCs w:val="false"/>
+                <w:sz w:val="22"/>
+                <w:szCs w:val="22"/>
+              </w:rPr>
+              <w:t xml:space="preserve"> (11.47× equity + 2.0× revenue share).</w:t>
             </w:r>
           </w:p>
         </w:tc>
@@ -1057,7 +1393,7 @@
                 <w:sz w:val="22"/>
                 <w:szCs w:val="22"/>
               </w:rPr>
-              <w:t xml:space="preserve">Investor economics</w:t>
+              <w:t xml:space="preserve">Voting / control</w:t>
             </w:r>
           </w:p>
         </w:tc>
@@ -1085,199 +1421,31 @@
                 <w:sz w:val="22"/>
                 <w:szCs w:val="22"/>
               </w:rPr>
-              <w:t xml:space="preserve">Per the one-pager (additive): a </w:t>
-            </w:r>
-            <w:r>
-              <w:rPr>
-                <w:rFonts w:ascii="Times New Roman" w:cs="Times New Roman" w:eastAsia="Times New Roman" w:hAnsi="Times New Roman"/>
-                <w:b/>
-                <w:bCs/>
-                <w:i w:val="false"/>
-                <w:iCs w:val="false"/>
-                <w:sz w:val="22"/>
-                <w:szCs w:val="22"/>
-              </w:rPr>
-              <w:t xml:space="preserve">temporary revenue share</w:t>
-            </w:r>
-            <w:r>
-              <w:rPr>
-                <w:rFonts w:ascii="Times New Roman" w:cs="Times New Roman" w:eastAsia="Times New Roman" w:hAnsi="Times New Roman"/>
-                <w:b w:val="false"/>
-                <w:bCs w:val="false"/>
-                <w:i w:val="false"/>
-                <w:iCs w:val="false"/>
-                <w:sz w:val="22"/>
-                <w:szCs w:val="22"/>
-              </w:rPr>
-              <w:t xml:space="preserve"> — </w:t>
-            </w:r>
-            <w:r>
-              <w:rPr>
-                <w:rFonts w:ascii="Times New Roman" w:cs="Times New Roman" w:eastAsia="Times New Roman" w:hAnsi="Times New Roman"/>
-                <w:b/>
-                <w:bCs/>
-                <w:i w:val="false"/>
-                <w:iCs w:val="false"/>
-                <w:sz w:val="22"/>
-                <w:szCs w:val="22"/>
-              </w:rPr>
-              <w:t xml:space="preserve">50% of ManCo gross cash revenue collected</w:t>
-            </w:r>
-            <w:r>
-              <w:rPr>
-                <w:rFonts w:ascii="Times New Roman" w:cs="Times New Roman" w:eastAsia="Times New Roman" w:hAnsi="Times New Roman"/>
-                <w:b w:val="false"/>
-                <w:bCs w:val="false"/>
-                <w:i w:val="false"/>
-                <w:iCs w:val="false"/>
-                <w:sz w:val="22"/>
-                <w:szCs w:val="22"/>
-              </w:rPr>
-              <w:t xml:space="preserve"> to Class A (pro rata) until </w:t>
-            </w:r>
-            <w:r>
-              <w:rPr>
-                <w:rFonts w:ascii="Times New Roman" w:cs="Times New Roman" w:eastAsia="Times New Roman" w:hAnsi="Times New Roman"/>
-                <w:b/>
-                <w:bCs/>
-                <w:i w:val="false"/>
-                <w:iCs w:val="false"/>
-                <w:sz w:val="22"/>
-                <w:szCs w:val="22"/>
-              </w:rPr>
-              <w:t xml:space="preserve">1.0×</w:t>
-            </w:r>
-            <w:r>
-              <w:rPr>
-                <w:rFonts w:ascii="Times New Roman" w:cs="Times New Roman" w:eastAsia="Times New Roman" w:hAnsi="Times New Roman"/>
-                <w:b w:val="false"/>
-                <w:bCs w:val="false"/>
-                <w:i w:val="false"/>
-                <w:iCs w:val="false"/>
-                <w:sz w:val="22"/>
-                <w:szCs w:val="22"/>
-              </w:rPr>
-              <w:t xml:space="preserve"> ($1.5M), then </w:t>
-            </w:r>
-            <w:r>
-              <w:rPr>
-                <w:rFonts w:ascii="Times New Roman" w:cs="Times New Roman" w:eastAsia="Times New Roman" w:hAnsi="Times New Roman"/>
-                <w:b/>
-                <w:bCs/>
-                <w:i w:val="false"/>
-                <w:iCs w:val="false"/>
-                <w:sz w:val="22"/>
-                <w:szCs w:val="22"/>
-              </w:rPr>
-              <w:t xml:space="preserve">10%</w:t>
-            </w:r>
-            <w:r>
-              <w:rPr>
-                <w:rFonts w:ascii="Times New Roman" w:cs="Times New Roman" w:eastAsia="Times New Roman" w:hAnsi="Times New Roman"/>
-                <w:b w:val="false"/>
-                <w:bCs w:val="false"/>
-                <w:i w:val="false"/>
-                <w:iCs w:val="false"/>
-                <w:sz w:val="22"/>
-                <w:szCs w:val="22"/>
-              </w:rPr>
-              <w:t xml:space="preserve"> until </w:t>
-            </w:r>
-            <w:r>
-              <w:rPr>
-                <w:rFonts w:ascii="Times New Roman" w:cs="Times New Roman" w:eastAsia="Times New Roman" w:hAnsi="Times New Roman"/>
-                <w:b/>
-                <w:bCs/>
-                <w:i w:val="false"/>
-                <w:iCs w:val="false"/>
-                <w:sz w:val="22"/>
-                <w:szCs w:val="22"/>
-              </w:rPr>
-              <w:t xml:space="preserve">2.0×</w:t>
-            </w:r>
-            <w:r>
-              <w:rPr>
-                <w:rFonts w:ascii="Times New Roman" w:cs="Times New Roman" w:eastAsia="Times New Roman" w:hAnsi="Times New Roman"/>
-                <w:b w:val="false"/>
-                <w:bCs w:val="false"/>
-                <w:i w:val="false"/>
-                <w:iCs w:val="false"/>
-                <w:sz w:val="22"/>
-                <w:szCs w:val="22"/>
-              </w:rPr>
-              <w:t xml:space="preserve"> ($3.0M) cumulative, then it </w:t>
-            </w:r>
-            <w:r>
-              <w:rPr>
-                <w:rFonts w:ascii="Times New Roman" w:cs="Times New Roman" w:eastAsia="Times New Roman" w:hAnsi="Times New Roman"/>
-                <w:b/>
-                <w:bCs/>
-                <w:i w:val="false"/>
-                <w:iCs w:val="false"/>
-                <w:sz w:val="22"/>
-                <w:szCs w:val="22"/>
-              </w:rPr>
-              <w:t xml:space="preserve">terminates</w:t>
-            </w:r>
-            <w:r>
-              <w:rPr>
-                <w:rFonts w:ascii="Times New Roman" w:cs="Times New Roman" w:eastAsia="Times New Roman" w:hAnsi="Times New Roman"/>
-                <w:b w:val="false"/>
-                <w:bCs w:val="false"/>
-                <w:i w:val="false"/>
-                <w:iCs w:val="false"/>
-                <w:sz w:val="22"/>
-                <w:szCs w:val="22"/>
-              </w:rPr>
-              <w:t xml:space="preserve"> — paid </w:t>
-            </w:r>
-            <w:r>
-              <w:rPr>
-                <w:rFonts w:ascii="Times New Roman" w:cs="Times New Roman" w:eastAsia="Times New Roman" w:hAnsi="Times New Roman"/>
-                <w:b/>
-                <w:bCs/>
-                <w:i w:val="false"/>
-                <w:iCs w:val="false"/>
-                <w:sz w:val="22"/>
-                <w:szCs w:val="22"/>
-              </w:rPr>
-              <w:t xml:space="preserve">in addition to</w:t>
-            </w:r>
-            <w:r>
-              <w:rPr>
-                <w:rFonts w:ascii="Times New Roman" w:cs="Times New Roman" w:eastAsia="Times New Roman" w:hAnsi="Times New Roman"/>
-                <w:b w:val="false"/>
-                <w:bCs w:val="false"/>
-                <w:i w:val="false"/>
-                <w:iCs w:val="false"/>
-                <w:sz w:val="22"/>
-                <w:szCs w:val="22"/>
-              </w:rPr>
-              <w:t xml:space="preserve"> a </w:t>
-            </w:r>
-            <w:r>
-              <w:rPr>
-                <w:rFonts w:ascii="Times New Roman" w:cs="Times New Roman" w:eastAsia="Times New Roman" w:hAnsi="Times New Roman"/>
-                <w:b/>
-                <w:bCs/>
-                <w:i w:val="false"/>
-                <w:iCs w:val="false"/>
-                <w:sz w:val="22"/>
-                <w:szCs w:val="22"/>
-              </w:rPr>
-              <w:t xml:space="preserve">permanent 15% equity</w:t>
-            </w:r>
-            <w:r>
-              <w:rPr>
-                <w:rFonts w:ascii="Times New Roman" w:cs="Times New Roman" w:eastAsia="Times New Roman" w:hAnsi="Times New Roman"/>
-                <w:b w:val="false"/>
-                <w:bCs w:val="false"/>
-                <w:i w:val="false"/>
-                <w:iCs w:val="false"/>
-                <w:sz w:val="22"/>
-                <w:szCs w:val="22"/>
-              </w:rPr>
-              <w:t xml:space="preserve"> (pro-rata distributions at all times, uncapped).</w:t>
+              <w:t xml:space="preserve">Investors' Class A votes 1/share, together with all common as a single class. Norman's Class B (10×) controls all stockholder votes and the board. Investors have </w:t>
+            </w:r>
+            <w:r>
+              <w:rPr>
+                <w:rFonts w:ascii="Times New Roman" w:cs="Times New Roman" w:eastAsia="Times New Roman" w:hAnsi="Times New Roman"/>
+                <w:b/>
+                <w:bCs/>
+                <w:i w:val="false"/>
+                <w:iCs w:val="false"/>
+                <w:sz w:val="22"/>
+                <w:szCs w:val="22"/>
+              </w:rPr>
+              <w:t xml:space="preserve">no control rights</w:t>
+            </w:r>
+            <w:r>
+              <w:rPr>
+                <w:rFonts w:ascii="Times New Roman" w:cs="Times New Roman" w:eastAsia="Times New Roman" w:hAnsi="Times New Roman"/>
+                <w:b w:val="false"/>
+                <w:bCs w:val="false"/>
+                <w:i w:val="false"/>
+                <w:iCs w:val="false"/>
+                <w:sz w:val="22"/>
+                <w:szCs w:val="22"/>
+              </w:rPr>
+              <w:t xml:space="preserve"> beyond limited protective provisions (below).</w:t>
             </w:r>
           </w:p>
         </w:tc>
@@ -1335,7 +1503,31 @@
                 <w:sz w:val="22"/>
                 <w:szCs w:val="22"/>
               </w:rPr>
-              <w:t xml:space="preserve">Annual financial statements + Schedule K-1s; periodic (at least annual) written updates. No inspection/management rights beyond this.</w:t>
+              <w:t xml:space="preserve">Annual financial statements + tax forms (</w:t>
+            </w:r>
+            <w:r>
+              <w:rPr>
+                <w:rFonts w:ascii="Times New Roman" w:cs="Times New Roman" w:eastAsia="Times New Roman" w:hAnsi="Times New Roman"/>
+                <w:b/>
+                <w:bCs/>
+                <w:i w:val="false"/>
+                <w:iCs w:val="false"/>
+                <w:sz w:val="22"/>
+                <w:szCs w:val="22"/>
+              </w:rPr>
+              <w:t xml:space="preserve">[K-1 for LLC → 1099-DIV/K for the corp as applicable]</w:t>
+            </w:r>
+            <w:r>
+              <w:rPr>
+                <w:rFonts w:ascii="Times New Roman" w:cs="Times New Roman" w:eastAsia="Times New Roman" w:hAnsi="Times New Roman"/>
+                <w:b w:val="false"/>
+                <w:bCs w:val="false"/>
+                <w:i w:val="false"/>
+                <w:iCs w:val="false"/>
+                <w:sz w:val="22"/>
+                <w:szCs w:val="22"/>
+              </w:rPr>
+              <w:t xml:space="preserve">); at least annual written updates.</w:t>
             </w:r>
           </w:p>
         </w:tc>
@@ -1453,67 +1645,43 @@
                 <w:sz w:val="22"/>
                 <w:szCs w:val="22"/>
               </w:rPr>
-              <w:t xml:space="preserve"> — elect to cause the Company to return to the Investors their </w:t>
-            </w:r>
-            <w:r>
-              <w:rPr>
-                <w:rFonts w:ascii="Times New Roman" w:cs="Times New Roman" w:eastAsia="Times New Roman" w:hAnsi="Times New Roman"/>
-                <w:b/>
-                <w:bCs/>
-                <w:i w:val="false"/>
-                <w:iCs w:val="false"/>
-                <w:sz w:val="22"/>
-                <w:szCs w:val="22"/>
-              </w:rPr>
-              <w:t xml:space="preserve">unreturned/undeployed capital</w:t>
-            </w:r>
-            <w:r>
-              <w:rPr>
-                <w:rFonts w:ascii="Times New Roman" w:cs="Times New Roman" w:eastAsia="Times New Roman" w:hAnsi="Times New Roman"/>
-                <w:b w:val="false"/>
-                <w:bCs w:val="false"/>
-                <w:i w:val="false"/>
-                <w:iCs w:val="false"/>
-                <w:sz w:val="22"/>
-                <w:szCs w:val="22"/>
-              </w:rPr>
-              <w:t xml:space="preserve"> (in whole or part, pro rata) if, in his good-faith judgment, the Company has </w:t>
-            </w:r>
-            <w:r>
-              <w:rPr>
-                <w:rFonts w:ascii="Times New Roman" w:cs="Times New Roman" w:eastAsia="Times New Roman" w:hAnsi="Times New Roman"/>
-                <w:b/>
-                <w:bCs/>
-                <w:i w:val="false"/>
-                <w:iCs w:val="false"/>
-                <w:sz w:val="22"/>
-                <w:szCs w:val="22"/>
-              </w:rPr>
-              <w:t xml:space="preserve">not made sufficient progress to responsibly continue deploying investor capital.</w:t>
-            </w:r>
-            <w:r>
-              <w:rPr>
-                <w:rFonts w:ascii="Times New Roman" w:cs="Times New Roman" w:eastAsia="Times New Roman" w:hAnsi="Times New Roman"/>
-                <w:b w:val="false"/>
-                <w:bCs w:val="false"/>
-                <w:i w:val="false"/>
-                <w:iCs w:val="false"/>
-                <w:sz w:val="22"/>
-                <w:szCs w:val="22"/>
-              </w:rPr>
-              <w:t xml:space="preserve"> Funded from available/undeployed cash. </w:t>
-            </w:r>
-            <w:r>
-              <w:rPr>
-                <w:rFonts w:ascii="Times New Roman" w:cs="Times New Roman" w:eastAsia="Times New Roman" w:hAnsi="Times New Roman"/>
-                <w:b/>
-                <w:bCs/>
-                <w:i w:val="false"/>
-                <w:iCs w:val="false"/>
-                <w:sz w:val="22"/>
-                <w:szCs w:val="22"/>
-              </w:rPr>
-              <w:t xml:space="preserve">[Define "sufficient progress" — pure good-faith discretion vs. objective milestones; and the mechanics — see note.]</w:t>
+              <w:t xml:space="preserve"> — cause the Company to return investors' </w:t>
+            </w:r>
+            <w:r>
+              <w:rPr>
+                <w:rFonts w:ascii="Times New Roman" w:cs="Times New Roman" w:eastAsia="Times New Roman" w:hAnsi="Times New Roman"/>
+                <w:b/>
+                <w:bCs/>
+                <w:i w:val="false"/>
+                <w:iCs w:val="false"/>
+                <w:sz w:val="22"/>
+                <w:szCs w:val="22"/>
+              </w:rPr>
+              <w:t xml:space="preserve">undeployed capital</w:t>
+            </w:r>
+            <w:r>
+              <w:rPr>
+                <w:rFonts w:ascii="Times New Roman" w:cs="Times New Roman" w:eastAsia="Times New Roman" w:hAnsi="Times New Roman"/>
+                <w:b w:val="false"/>
+                <w:bCs w:val="false"/>
+                <w:i w:val="false"/>
+                <w:iCs w:val="false"/>
+                <w:sz w:val="22"/>
+                <w:szCs w:val="22"/>
+              </w:rPr>
+              <w:t xml:space="preserve"> (from available reserve, pro rata) if in his good-faith judgment the Company has not made sufficient progress to responsibly keep deploying it. </w:t>
+            </w:r>
+            <w:r>
+              <w:rPr>
+                <w:rFonts w:ascii="Times New Roman" w:cs="Times New Roman" w:eastAsia="Times New Roman" w:hAnsi="Times New Roman"/>
+                <w:b/>
+                <w:bCs/>
+                <w:i w:val="false"/>
+                <w:iCs w:val="false"/>
+                <w:sz w:val="22"/>
+                <w:szCs w:val="22"/>
+              </w:rPr>
+              <w:t xml:space="preserve">[Return of capital only; does not, by itself, reduce shares — see the return-of-capital vs. redemption discussion.]</w:t>
             </w:r>
           </w:p>
         </w:tc>
@@ -1571,7 +1739,7 @@
                 <w:sz w:val="22"/>
                 <w:szCs w:val="22"/>
               </w:rPr>
-              <w:t xml:space="preserve">Units are restricted securities; no transfer without Manager consent; Company/Manager right of first refusal.</w:t>
+              <w:t xml:space="preserve">Restricted stock; Company right of first refusal + co-sale; no transfer without Board consent.</w:t>
             </w:r>
           </w:p>
         </w:tc>
@@ -1641,7 +1809,7 @@
                 <w:sz w:val="22"/>
                 <w:szCs w:val="22"/>
               </w:rPr>
-              <w:t xml:space="preserve"> Manager may require Investors to participate in a Company sale on the same terms. </w:t>
+              <w:t xml:space="preserve"> on a Board-approved sale, all stockholders participate on the same per-share terms. </w:t>
             </w:r>
             <w:r>
               <w:rPr>
@@ -1665,19 +1833,19 @@
                 <w:sz w:val="22"/>
                 <w:szCs w:val="22"/>
               </w:rPr>
-              <w:t xml:space="preserve"> Investors may participate pro rata if founders sell. </w:t>
-            </w:r>
-            <w:r>
-              <w:rPr>
-                <w:rFonts w:ascii="Times New Roman" w:cs="Times New Roman" w:eastAsia="Times New Roman" w:hAnsi="Times New Roman"/>
-                <w:b/>
-                <w:bCs/>
-                <w:i w:val="false"/>
-                <w:iCs w:val="false"/>
-                <w:sz w:val="22"/>
-                <w:szCs w:val="22"/>
-              </w:rPr>
-              <w:t xml:space="preserve">[Confirm — recommended so a sale isn't blocked.]</w:t>
+              <w:t xml:space="preserve"> investors may participate pro rata. </w:t>
+            </w:r>
+            <w:r>
+              <w:rPr>
+                <w:rFonts w:ascii="Times New Roman" w:cs="Times New Roman" w:eastAsia="Times New Roman" w:hAnsi="Times New Roman"/>
+                <w:b/>
+                <w:bCs/>
+                <w:i w:val="false"/>
+                <w:iCs w:val="false"/>
+                <w:sz w:val="22"/>
+                <w:szCs w:val="22"/>
+              </w:rPr>
+              <w:t xml:space="preserve">[Confirm.]</w:t>
             </w:r>
           </w:p>
         </w:tc>
@@ -1707,7 +1875,7 @@
                 <w:sz w:val="22"/>
                 <w:szCs w:val="22"/>
               </w:rPr>
-              <w:t xml:space="preserve">Securities compliance</w:t>
+              <w:t xml:space="preserve">Protective provisions (investors, limited)</w:t>
             </w:r>
           </w:p>
         </w:tc>
@@ -1735,55 +1903,67 @@
                 <w:sz w:val="22"/>
                 <w:szCs w:val="22"/>
               </w:rPr>
-              <w:t xml:space="preserve">Private placement under </w:t>
-            </w:r>
-            <w:r>
-              <w:rPr>
-                <w:rFonts w:ascii="Times New Roman" w:cs="Times New Roman" w:eastAsia="Times New Roman" w:hAnsi="Times New Roman"/>
-                <w:b/>
-                <w:bCs/>
-                <w:i w:val="false"/>
-                <w:iCs w:val="false"/>
-                <w:sz w:val="22"/>
-                <w:szCs w:val="22"/>
-              </w:rPr>
-              <w:t xml:space="preserve">Reg D Rule 506(b)</w:t>
-            </w:r>
-            <w:r>
-              <w:rPr>
-                <w:rFonts w:ascii="Times New Roman" w:cs="Times New Roman" w:eastAsia="Times New Roman" w:hAnsi="Times New Roman"/>
-                <w:b w:val="false"/>
-                <w:bCs w:val="false"/>
-                <w:i w:val="false"/>
-                <w:iCs w:val="false"/>
-                <w:sz w:val="22"/>
-                <w:szCs w:val="22"/>
-              </w:rPr>
-              <w:t xml:space="preserve">; </w:t>
-            </w:r>
-            <w:r>
-              <w:rPr>
-                <w:rFonts w:ascii="Times New Roman" w:cs="Times New Roman" w:eastAsia="Times New Roman" w:hAnsi="Times New Roman"/>
-                <w:b/>
-                <w:bCs/>
-                <w:i w:val="false"/>
-                <w:iCs w:val="false"/>
-                <w:sz w:val="22"/>
-                <w:szCs w:val="22"/>
-              </w:rPr>
-              <w:t xml:space="preserve">accredited investors only</w:t>
-            </w:r>
-            <w:r>
-              <w:rPr>
-                <w:rFonts w:ascii="Times New Roman" w:cs="Times New Roman" w:eastAsia="Times New Roman" w:hAnsi="Times New Roman"/>
-                <w:b w:val="false"/>
-                <w:bCs w:val="false"/>
-                <w:i w:val="false"/>
-                <w:iCs w:val="false"/>
-                <w:sz w:val="22"/>
-                <w:szCs w:val="22"/>
-              </w:rPr>
-              <w:t xml:space="preserve">; Form D + state blue-sky notices to be filed by counsel; restricted units, standard investment-intent reps.</w:t>
+              <w:t xml:space="preserve">Consent of a majority of Class A investors to: (a) amend the charter/agreements in a way that </w:t>
+            </w:r>
+            <w:r>
+              <w:rPr>
+                <w:rFonts w:ascii="Times New Roman" w:cs="Times New Roman" w:eastAsia="Times New Roman" w:hAnsi="Times New Roman"/>
+                <w:b/>
+                <w:bCs/>
+                <w:i w:val="false"/>
+                <w:iCs w:val="false"/>
+                <w:sz w:val="22"/>
+                <w:szCs w:val="22"/>
+              </w:rPr>
+              <w:t xml:space="preserve">disproportionately, adversely</w:t>
+            </w:r>
+            <w:r>
+              <w:rPr>
+                <w:rFonts w:ascii="Times New Roman" w:cs="Times New Roman" w:eastAsia="Times New Roman" w:hAnsi="Times New Roman"/>
+                <w:b w:val="false"/>
+                <w:bCs w:val="false"/>
+                <w:i w:val="false"/>
+                <w:iCs w:val="false"/>
+                <w:sz w:val="22"/>
+                <w:szCs w:val="22"/>
+              </w:rPr>
+              <w:t xml:space="preserve"> affects them; or (b) issue securities </w:t>
+            </w:r>
+            <w:r>
+              <w:rPr>
+                <w:rFonts w:ascii="Times New Roman" w:cs="Times New Roman" w:eastAsia="Times New Roman" w:hAnsi="Times New Roman"/>
+                <w:b/>
+                <w:bCs/>
+                <w:i w:val="false"/>
+                <w:iCs w:val="false"/>
+                <w:sz w:val="22"/>
+                <w:szCs w:val="22"/>
+              </w:rPr>
+              <w:t xml:space="preserve">senior to</w:t>
+            </w:r>
+            <w:r>
+              <w:rPr>
+                <w:rFonts w:ascii="Times New Roman" w:cs="Times New Roman" w:eastAsia="Times New Roman" w:hAnsi="Times New Roman"/>
+                <w:b w:val="false"/>
+                <w:bCs w:val="false"/>
+                <w:i w:val="false"/>
+                <w:iCs w:val="false"/>
+                <w:sz w:val="22"/>
+                <w:szCs w:val="22"/>
+              </w:rPr>
+              <w:t xml:space="preserve"> their Revenue-Share Right. </w:t>
+            </w:r>
+            <w:r>
+              <w:rPr>
+                <w:rFonts w:ascii="Times New Roman" w:cs="Times New Roman" w:eastAsia="Times New Roman" w:hAnsi="Times New Roman"/>
+                <w:b w:val="false"/>
+                <w:bCs w:val="false"/>
+                <w:i/>
+                <w:iCs/>
+                <w:sz w:val="22"/>
+                <w:szCs w:val="22"/>
+              </w:rPr>
+              <w:t xml:space="preserve">All other decisions rest with the Board/Norman._</w:t>
             </w:r>
           </w:p>
         </w:tc>
@@ -1813,7 +1993,7 @@
                 <w:sz w:val="22"/>
                 <w:szCs w:val="22"/>
               </w:rPr>
-              <w:t xml:space="preserve">Governing law / disputes</w:t>
+              <w:t xml:space="preserve">Founder stock (the other 85%)</w:t>
             </w:r>
           </w:p>
         </w:tc>
@@ -1841,31 +2021,67 @@
                 <w:sz w:val="22"/>
                 <w:szCs w:val="22"/>
               </w:rPr>
-              <w:t xml:space="preserve">Delaware law; </w:t>
-            </w:r>
-            <w:r>
-              <w:rPr>
-                <w:rFonts w:ascii="Times New Roman" w:cs="Times New Roman" w:eastAsia="Times New Roman" w:hAnsi="Times New Roman"/>
-                <w:b/>
-                <w:bCs/>
-                <w:i w:val="false"/>
-                <w:iCs w:val="false"/>
-                <w:sz w:val="22"/>
-                <w:szCs w:val="22"/>
-              </w:rPr>
-              <w:t xml:space="preserve">[venue / arbitration — confirm]</w:t>
-            </w:r>
-            <w:r>
-              <w:rPr>
-                <w:rFonts w:ascii="Times New Roman" w:cs="Times New Roman" w:eastAsia="Times New Roman" w:hAnsi="Times New Roman"/>
-                <w:b w:val="false"/>
-                <w:bCs w:val="false"/>
-                <w:i w:val="false"/>
-                <w:iCs w:val="false"/>
-                <w:sz w:val="22"/>
-                <w:szCs w:val="22"/>
-              </w:rPr>
-              <w:t xml:space="preserve">.</w:t>
+              <w:t xml:space="preserve">Held by Norman (</w:t>
+            </w:r>
+            <w:r>
+              <w:rPr>
+                <w:rFonts w:ascii="Times New Roman" w:cs="Times New Roman" w:eastAsia="Times New Roman" w:hAnsi="Times New Roman"/>
+                <w:b/>
+                <w:bCs/>
+                <w:i w:val="false"/>
+                <w:iCs w:val="false"/>
+                <w:sz w:val="22"/>
+                <w:szCs w:val="22"/>
+              </w:rPr>
+              <w:t xml:space="preserve">Class B</w:t>
+            </w:r>
+            <w:r>
+              <w:rPr>
+                <w:rFonts w:ascii="Times New Roman" w:cs="Times New Roman" w:eastAsia="Times New Roman" w:hAnsi="Times New Roman"/>
+                <w:b w:val="false"/>
+                <w:bCs w:val="false"/>
+                <w:i w:val="false"/>
+                <w:iCs w:val="false"/>
+                <w:sz w:val="22"/>
+                <w:szCs w:val="22"/>
+              </w:rPr>
+              <w:t xml:space="preserve">, super-voting) and Ankur/Sunjay/Greg (</w:t>
+            </w:r>
+            <w:r>
+              <w:rPr>
+                <w:rFonts w:ascii="Times New Roman" w:cs="Times New Roman" w:eastAsia="Times New Roman" w:hAnsi="Times New Roman"/>
+                <w:b/>
+                <w:bCs/>
+                <w:i w:val="false"/>
+                <w:iCs w:val="false"/>
+                <w:sz w:val="22"/>
+                <w:szCs w:val="22"/>
+              </w:rPr>
+              <w:t xml:space="preserve">Class A Common</w:t>
+            </w:r>
+            <w:r>
+              <w:rPr>
+                <w:rFonts w:ascii="Times New Roman" w:cs="Times New Roman" w:eastAsia="Times New Roman" w:hAnsi="Times New Roman"/>
+                <w:b w:val="false"/>
+                <w:bCs w:val="false"/>
+                <w:i w:val="false"/>
+                <w:iCs w:val="false"/>
+                <w:sz w:val="22"/>
+                <w:szCs w:val="22"/>
+              </w:rPr>
+              <w:t xml:space="preserve">, ordinary). </w:t>
+            </w:r>
+            <w:r>
+              <w:rPr>
+                <w:rFonts w:ascii="Times New Roman" w:cs="Times New Roman" w:eastAsia="Times New Roman" w:hAnsi="Times New Roman"/>
+                <w:b/>
+                <w:bCs/>
+                <w:i w:val="false"/>
+                <w:iCs w:val="false"/>
+                <w:sz w:val="22"/>
+                <w:szCs w:val="22"/>
+              </w:rPr>
+              <w:t xml:space="preserve">[Confirm each founder's share count and vesting; note Ankur/Sunjay/Greg currently hold nothing — issuance to be documented.]</w:t>
             </w:r>
           </w:p>
         </w:tc>
@@ -1895,7 +2111,7 @@
                 <w:sz w:val="22"/>
                 <w:szCs w:val="22"/>
               </w:rPr>
-              <w:t xml:space="preserve">Confidentiality / non-circumvention</w:t>
+              <w:t xml:space="preserve">Securities compliance</w:t>
             </w:r>
           </w:p>
         </w:tc>
@@ -1923,7 +2139,31 @@
                 <w:sz w:val="22"/>
                 <w:szCs w:val="22"/>
               </w:rPr>
-              <w:t xml:space="preserve">Investors bound by confidentiality + the existing Cinderella non-circumvention framework.</w:t>
+              <w:t xml:space="preserve">Reg D </w:t>
+            </w:r>
+            <w:r>
+              <w:rPr>
+                <w:rFonts w:ascii="Times New Roman" w:cs="Times New Roman" w:eastAsia="Times New Roman" w:hAnsi="Times New Roman"/>
+                <w:b/>
+                <w:bCs/>
+                <w:i w:val="false"/>
+                <w:iCs w:val="false"/>
+                <w:sz w:val="22"/>
+                <w:szCs w:val="22"/>
+              </w:rPr>
+              <w:t xml:space="preserve">Rule 506(b)</w:t>
+            </w:r>
+            <w:r>
+              <w:rPr>
+                <w:rFonts w:ascii="Times New Roman" w:cs="Times New Roman" w:eastAsia="Times New Roman" w:hAnsi="Times New Roman"/>
+                <w:b w:val="false"/>
+                <w:bCs w:val="false"/>
+                <w:i w:val="false"/>
+                <w:iCs w:val="false"/>
+                <w:sz w:val="22"/>
+                <w:szCs w:val="22"/>
+              </w:rPr>
+              <w:t xml:space="preserve">, accredited investors only; Form D + blue-sky; restricted-stock legends.</w:t>
             </w:r>
           </w:p>
         </w:tc>
@@ -1953,7 +2193,7 @@
                 <w:sz w:val="22"/>
                 <w:szCs w:val="22"/>
               </w:rPr>
-              <w:t xml:space="preserve">Documents</w:t>
+              <w:t xml:space="preserve">Governing docs</w:t>
             </w:r>
           </w:p>
         </w:tc>
@@ -1981,135 +2221,127 @@
                 <w:sz w:val="22"/>
                 <w:szCs w:val="22"/>
               </w:rPr>
-              <w:t xml:space="preserve">(1) this Term Sheet; (2) Subscription Agreement + Accredited Investor Questionnaire; (3) Amended &amp; Restated Operating Agreement.</w:t>
-            </w:r>
-          </w:p>
-        </w:tc>
-      </w:tr>
-      <w:tr>
-        <w:tc>
-          <w:tcPr>
-            <w:tcW w:type="dxa" w:w="2800"/>
-            <w:tcMar>
-              <w:top w:type="dxa" w:w="60"/>
-              <w:left w:type="dxa" w:w="90"/>
-              <w:bottom w:type="dxa" w:w="60"/>
-              <w:right w:type="dxa" w:w="90"/>
-            </w:tcMar>
-          </w:tcPr>
-          <w:p>
-            <w:pPr>
-              <w:spacing w:after="40"/>
-            </w:pPr>
-            <w:r>
-              <w:rPr>
-                <w:rFonts w:ascii="Times New Roman" w:cs="Times New Roman" w:eastAsia="Times New Roman" w:hAnsi="Times New Roman"/>
-                <w:b/>
-                <w:bCs/>
-                <w:i w:val="false"/>
-                <w:iCs w:val="false"/>
-                <w:sz w:val="22"/>
-                <w:szCs w:val="22"/>
-              </w:rPr>
-              <w:t xml:space="preserve">Expenses</w:t>
-            </w:r>
-          </w:p>
-        </w:tc>
-        <w:tc>
-          <w:tcPr>
-            <w:tcW w:type="dxa" w:w="6560"/>
-            <w:tcMar>
-              <w:top w:type="dxa" w:w="60"/>
-              <w:left w:type="dxa" w:w="90"/>
-              <w:bottom w:type="dxa" w:w="60"/>
-              <w:right w:type="dxa" w:w="90"/>
-            </w:tcMar>
-          </w:tcPr>
-          <w:p>
-            <w:pPr>
-              <w:spacing w:after="40"/>
-            </w:pPr>
-            <w:r>
-              <w:rPr>
-                <w:rFonts w:ascii="Times New Roman" w:cs="Times New Roman" w:eastAsia="Times New Roman" w:hAnsi="Times New Roman"/>
-                <w:b w:val="false"/>
-                <w:bCs w:val="false"/>
-                <w:i w:val="false"/>
-                <w:iCs w:val="false"/>
-                <w:sz w:val="22"/>
-                <w:szCs w:val="22"/>
-              </w:rPr>
-              <w:t xml:space="preserve">Each party bears its own; Company pays its own formation/counsel costs.</w:t>
-            </w:r>
-          </w:p>
-        </w:tc>
-      </w:tr>
-      <w:tr>
-        <w:tc>
-          <w:tcPr>
-            <w:tcW w:type="dxa" w:w="2800"/>
-            <w:tcMar>
-              <w:top w:type="dxa" w:w="60"/>
-              <w:left w:type="dxa" w:w="90"/>
-              <w:bottom w:type="dxa" w:w="60"/>
-              <w:right w:type="dxa" w:w="90"/>
-            </w:tcMar>
-          </w:tcPr>
-          <w:p>
-            <w:pPr>
-              <w:spacing w:after="40"/>
-            </w:pPr>
-            <w:r>
-              <w:rPr>
-                <w:rFonts w:ascii="Times New Roman" w:cs="Times New Roman" w:eastAsia="Times New Roman" w:hAnsi="Times New Roman"/>
-                <w:b/>
-                <w:bCs/>
-                <w:i w:val="false"/>
-                <w:iCs w:val="false"/>
-                <w:sz w:val="22"/>
-                <w:szCs w:val="22"/>
-              </w:rPr>
-              <w:t xml:space="preserve">Conditions</w:t>
-            </w:r>
-          </w:p>
-        </w:tc>
-        <w:tc>
-          <w:tcPr>
-            <w:tcW w:type="dxa" w:w="6560"/>
-            <w:tcMar>
-              <w:top w:type="dxa" w:w="60"/>
-              <w:left w:type="dxa" w:w="90"/>
-              <w:bottom w:type="dxa" w:w="60"/>
-              <w:right w:type="dxa" w:w="90"/>
-            </w:tcMar>
-          </w:tcPr>
-          <w:p>
-            <w:pPr>
-              <w:spacing w:after="40"/>
-            </w:pPr>
-            <w:r>
-              <w:rPr>
-                <w:rFonts w:ascii="Times New Roman" w:cs="Times New Roman" w:eastAsia="Times New Roman" w:hAnsi="Times New Roman"/>
-                <w:b w:val="false"/>
-                <w:bCs w:val="false"/>
-                <w:i w:val="false"/>
-                <w:iCs w:val="false"/>
-                <w:sz w:val="22"/>
-                <w:szCs w:val="22"/>
-              </w:rPr>
-              <w:t xml:space="preserve">Execution of the A&amp;R Operating Agreement and Subscription Agreement; satisfactory accreditation; </w:t>
-            </w:r>
-            <w:r>
-              <w:rPr>
-                <w:rFonts w:ascii="Times New Roman" w:cs="Times New Roman" w:eastAsia="Times New Roman" w:hAnsi="Times New Roman"/>
-                <w:b/>
-                <w:bCs/>
-                <w:i w:val="false"/>
-                <w:iCs w:val="false"/>
-                <w:sz w:val="22"/>
-                <w:szCs w:val="22"/>
-              </w:rPr>
-              <w:t xml:space="preserve">counsel (Loeb) sign-off on securities compliance.</w:t>
+              <w:t xml:space="preserve">A&amp;R </w:t>
+            </w:r>
+            <w:r>
+              <w:rPr>
+                <w:rFonts w:ascii="Times New Roman" w:cs="Times New Roman" w:eastAsia="Times New Roman" w:hAnsi="Times New Roman"/>
+                <w:b/>
+                <w:bCs/>
+                <w:i w:val="false"/>
+                <w:iCs w:val="false"/>
+                <w:sz w:val="22"/>
+                <w:szCs w:val="22"/>
+              </w:rPr>
+              <w:t xml:space="preserve">Certificate of Incorporation</w:t>
+            </w:r>
+            <w:r>
+              <w:rPr>
+                <w:rFonts w:ascii="Times New Roman" w:cs="Times New Roman" w:eastAsia="Times New Roman" w:hAnsi="Times New Roman"/>
+                <w:b w:val="false"/>
+                <w:bCs w:val="false"/>
+                <w:i w:val="false"/>
+                <w:iCs w:val="false"/>
+                <w:sz w:val="22"/>
+                <w:szCs w:val="22"/>
+              </w:rPr>
+              <w:t xml:space="preserve"> (control terms), </w:t>
+            </w:r>
+            <w:r>
+              <w:rPr>
+                <w:rFonts w:ascii="Times New Roman" w:cs="Times New Roman" w:eastAsia="Times New Roman" w:hAnsi="Times New Roman"/>
+                <w:b/>
+                <w:bCs/>
+                <w:i w:val="false"/>
+                <w:iCs w:val="false"/>
+                <w:sz w:val="22"/>
+                <w:szCs w:val="22"/>
+              </w:rPr>
+              <w:t xml:space="preserve">Bylaws</w:t>
+            </w:r>
+            <w:r>
+              <w:rPr>
+                <w:rFonts w:ascii="Times New Roman" w:cs="Times New Roman" w:eastAsia="Times New Roman" w:hAnsi="Times New Roman"/>
+                <w:b w:val="false"/>
+                <w:bCs w:val="false"/>
+                <w:i w:val="false"/>
+                <w:iCs w:val="false"/>
+                <w:sz w:val="22"/>
+                <w:szCs w:val="22"/>
+              </w:rPr>
+              <w:t xml:space="preserve"> (board/officers), </w:t>
+            </w:r>
+            <w:r>
+              <w:rPr>
+                <w:rFonts w:ascii="Times New Roman" w:cs="Times New Roman" w:eastAsia="Times New Roman" w:hAnsi="Times New Roman"/>
+                <w:b/>
+                <w:bCs/>
+                <w:i w:val="false"/>
+                <w:iCs w:val="false"/>
+                <w:sz w:val="22"/>
+                <w:szCs w:val="22"/>
+              </w:rPr>
+              <w:t xml:space="preserve">Stockholders' Agreement</w:t>
+            </w:r>
+            <w:r>
+              <w:rPr>
+                <w:rFonts w:ascii="Times New Roman" w:cs="Times New Roman" w:eastAsia="Times New Roman" w:hAnsi="Times New Roman"/>
+                <w:b w:val="false"/>
+                <w:bCs w:val="false"/>
+                <w:i w:val="false"/>
+                <w:iCs w:val="false"/>
+                <w:sz w:val="22"/>
+                <w:szCs w:val="22"/>
+              </w:rPr>
+              <w:t xml:space="preserve"> (transfer/drag/tag/info/Ankur right/protective provisions), </w:t>
+            </w:r>
+            <w:r>
+              <w:rPr>
+                <w:rFonts w:ascii="Times New Roman" w:cs="Times New Roman" w:eastAsia="Times New Roman" w:hAnsi="Times New Roman"/>
+                <w:b/>
+                <w:bCs/>
+                <w:i w:val="false"/>
+                <w:iCs w:val="false"/>
+                <w:sz w:val="22"/>
+                <w:szCs w:val="22"/>
+              </w:rPr>
+              <w:t xml:space="preserve">Stock Purchase (Subscription) Agreement</w:t>
+            </w:r>
+            <w:r>
+              <w:rPr>
+                <w:rFonts w:ascii="Times New Roman" w:cs="Times New Roman" w:eastAsia="Times New Roman" w:hAnsi="Times New Roman"/>
+                <w:b w:val="false"/>
+                <w:bCs w:val="false"/>
+                <w:i w:val="false"/>
+                <w:iCs w:val="false"/>
+                <w:sz w:val="22"/>
+                <w:szCs w:val="22"/>
+              </w:rPr>
+              <w:t xml:space="preserve"> + Accredited Investor Questionnaire, </w:t>
+            </w:r>
+            <w:r>
+              <w:rPr>
+                <w:rFonts w:ascii="Times New Roman" w:cs="Times New Roman" w:eastAsia="Times New Roman" w:hAnsi="Times New Roman"/>
+                <w:b/>
+                <w:bCs/>
+                <w:i w:val="false"/>
+                <w:iCs w:val="false"/>
+                <w:sz w:val="22"/>
+                <w:szCs w:val="22"/>
+              </w:rPr>
+              <w:t xml:space="preserve">[Revenue-Share Agreement OR Series Seed Preferred terms]</w:t>
+            </w:r>
+            <w:r>
+              <w:rPr>
+                <w:rFonts w:ascii="Times New Roman" w:cs="Times New Roman" w:eastAsia="Times New Roman" w:hAnsi="Times New Roman"/>
+                <w:b w:val="false"/>
+                <w:bCs w:val="false"/>
+                <w:i w:val="false"/>
+                <w:iCs w:val="false"/>
+                <w:sz w:val="22"/>
+                <w:szCs w:val="22"/>
+              </w:rPr>
+              <w:t xml:space="preserve">.</w:t>
             </w:r>
           </w:p>
         </w:tc>
@@ -2162,7 +2394,7 @@
           <w:sz w:val="22"/>
           <w:szCs w:val="22"/>
         </w:rPr>
-        <w:t xml:space="preserve">⚠️ The open terms that actually matter (lock these with Loeb/Sunjay)</w:t>
+        <w:t xml:space="preserve">⚠️ Open terms that actually matter</w:t>
       </w:r>
     </w:p>
     <w:p>
@@ -2187,7 +2419,7 @@
           <w:sz w:val="22"/>
           <w:szCs w:val="22"/>
         </w:rPr>
-        <w:t xml:space="preserve">1. Waterfall — DECIDED: additive, per the one-pager.</w:t>
+        <w:t xml:space="preserve">1. Investor economics don't fit the current charter — the #1 item.</w:t>
       </w:r>
       <w:r>
         <w:rPr>
@@ -2199,7 +2431,7 @@
           <w:sz w:val="22"/>
           <w:szCs w:val="22"/>
         </w:rPr>
-        <w:t xml:space="preserve"> The revenue share (50%→1×, 10%→2×, then terminates) is a </w:t>
+        <w:t xml:space="preserve"> Your charter authorizes only </w:t>
       </w:r>
       <w:r>
         <w:rPr>
@@ -2211,7 +2443,7 @@
           <w:sz w:val="22"/>
           <w:szCs w:val="22"/>
         </w:rPr>
-        <w:t xml:space="preserve">temporary preferred return paid IN ADDITION TO the permanent 15% equity</w:t>
+        <w:t xml:space="preserve">Class A / Class B *Common*, "identical except voting," with equal dividends/distributions.</w:t>
       </w:r>
       <w:r>
         <w:rPr>
@@ -2223,7 +2455,7 @@
           <w:sz w:val="22"/>
           <w:szCs w:val="22"/>
         </w:rPr>
-        <w:t xml:space="preserve">, as the one-pager reads. Drafted this way in the OA (§4.1). </w:t>
+        <w:t xml:space="preserve"> The promised </w:t>
       </w:r>
       <w:r>
         <w:rPr>
@@ -2235,7 +2467,7 @@
           <w:sz w:val="22"/>
           <w:szCs w:val="22"/>
         </w:rPr>
-        <w:t xml:space="preserve">Consequence to action:</w:t>
+        <w:t xml:space="preserve">revenue-share preference</w:t>
       </w:r>
       <w:r>
         <w:rPr>
@@ -2247,8 +2479,18 @@
           <w:sz w:val="22"/>
           <w:szCs w:val="22"/>
         </w:rPr>
-        <w:t xml:space="preserve"> this pays Class A </w:t>
-      </w:r>
+        <w:t xml:space="preserve"> is a *preferred* right common stock can't carry. Fix with Loeb, choose one:</w:t>
+      </w:r>
+    </w:p>
+    <w:p>
+      <w:pPr>
+        <w:pStyle w:val="ListParagraph"/>
+        <w:numPr>
+          <w:ilvl w:val="0"/>
+          <w:numId w:val="1"/>
+        </w:numPr>
+        <w:spacing w:after="40"/>
+      </w:pPr>
       <w:r>
         <w:rPr>
           <w:rFonts w:ascii="Times New Roman" w:cs="Times New Roman" w:eastAsia="Times New Roman" w:hAnsi="Times New Roman"/>
@@ -2259,7 +2501,7 @@
           <w:sz w:val="22"/>
           <w:szCs w:val="22"/>
         </w:rPr>
-        <w:t xml:space="preserve">more than 15% of total</w:t>
+        <w:t xml:space="preserve">(a) Common + separate Revenue-Share Agreement</w:t>
       </w:r>
       <w:r>
         <w:rPr>
@@ -2271,7 +2513,7 @@
           <w:sz w:val="22"/>
           <w:szCs w:val="22"/>
         </w:rPr>
-        <w:t xml:space="preserve">, so the investor MOIC is </w:t>
+        <w:t xml:space="preserve"> (investors get 15% Class A Common </w:t>
       </w:r>
       <w:r>
         <w:rPr>
@@ -2283,7 +2525,7 @@
           <w:sz w:val="22"/>
           <w:szCs w:val="22"/>
         </w:rPr>
-        <w:t xml:space="preserve">higher than the ~11×</w:t>
+        <w:t xml:space="preserve">plus</w:t>
       </w:r>
       <w:r>
         <w:rPr>
@@ -2295,7 +2537,7 @@
           <w:sz w:val="22"/>
           <w:szCs w:val="22"/>
         </w:rPr>
-        <w:t xml:space="preserve"> in your model — </w:t>
+        <w:t xml:space="preserve"> a contractual 50%/10%-to-2× revenue-share right). Clean cap table. </w:t>
       </w:r>
       <w:r>
         <w:rPr>
@@ -2307,7 +2549,29 @@
           <w:sz w:val="22"/>
           <w:szCs w:val="22"/>
         </w:rPr>
-        <w:t xml:space="preserve">the financial model must be updated to match</w:t>
+        <w:t xml:space="preserve">Recommended.</w:t>
+      </w:r>
+    </w:p>
+    <w:p>
+      <w:pPr>
+        <w:pStyle w:val="ListParagraph"/>
+        <w:numPr>
+          <w:ilvl w:val="0"/>
+          <w:numId w:val="1"/>
+        </w:numPr>
+        <w:spacing w:after="40"/>
+      </w:pPr>
+      <w:r>
+        <w:rPr>
+          <w:rFonts w:ascii="Times New Roman" w:cs="Times New Roman" w:eastAsia="Times New Roman" w:hAnsi="Times New Roman"/>
+          <w:b/>
+          <w:bCs/>
+          <w:i w:val="false"/>
+          <w:iCs w:val="false"/>
+          <w:sz w:val="22"/>
+          <w:szCs w:val="22"/>
+        </w:rPr>
+        <w:t xml:space="preserve">(b) Authorize a Series Seed Preferred</w:t>
       </w:r>
       <w:r>
         <w:rPr>
@@ -2319,21 +2583,25 @@
           <w:sz w:val="22"/>
           <w:szCs w:val="22"/>
         </w:rPr>
-        <w:t xml:space="preserve"> (it currently computes a flat 15% and understates the investor take / overstates ManCo's share). Have counsel define the sweep basis vs. equity basis so the two streams don't unintentionally double-count.</w:t>
+        <w:t xml:space="preserve"> in the charter carrying the revenue-share preference. Requires another charter amendment.</w:t>
       </w:r>
     </w:p>
     <w:p>
       <w:pPr>
-        <w:spacing w:after="60"/>
-      </w:pPr>
-      <w:r>
-        <w:t xml:space="preserve"/>
-      </w:r>
-    </w:p>
-    <w:p>
-      <w:pPr>
         <w:spacing w:after="80"/>
       </w:pPr>
+      <w:r>
+        <w:rPr>
+          <w:rFonts w:ascii="Times New Roman" w:cs="Times New Roman" w:eastAsia="Times New Roman" w:hAnsi="Times New Roman"/>
+          <w:b w:val="false"/>
+          <w:bCs w:val="false"/>
+          <w:i w:val="false"/>
+          <w:iCs w:val="false"/>
+          <w:sz w:val="22"/>
+          <w:szCs w:val="22"/>
+        </w:rPr>
+        <w:t xml:space="preserve">Also: a </w:t>
+      </w:r>
       <w:r>
         <w:rPr>
           <w:rFonts w:ascii="Times New Roman" w:cs="Times New Roman" w:eastAsia="Times New Roman" w:hAnsi="Times New Roman"/>
@@ -2344,7 +2612,7 @@
           <w:sz w:val="22"/>
           <w:szCs w:val="22"/>
         </w:rPr>
-        <w:t xml:space="preserve">2. Basis — RESOLVED.</w:t>
+        <w:t xml:space="preserve">% of *gross revenue</w:t>
       </w:r>
       <w:r>
         <w:rPr>
@@ -2356,8 +2624,21 @@
           <w:sz w:val="22"/>
           <w:szCs w:val="22"/>
         </w:rPr>
-        <w:t xml:space="preserve"> The one-pager confirms the sweep is </w:t>
-      </w:r>
+        <w:t xml:space="preserve">* is an unusual equity feature (revenue-based-financing / royalty flavor); Loeb should confirm structure and tax.</w:t>
+      </w:r>
+    </w:p>
+    <w:p>
+      <w:pPr>
+        <w:spacing w:after="60"/>
+      </w:pPr>
+      <w:r>
+        <w:t xml:space="preserve"/>
+      </w:r>
+    </w:p>
+    <w:p>
+      <w:pPr>
+        <w:spacing w:after="80"/>
+      </w:pPr>
       <w:r>
         <w:rPr>
           <w:rFonts w:ascii="Times New Roman" w:cs="Times New Roman" w:eastAsia="Times New Roman" w:hAnsi="Times New Roman"/>
@@ -2368,7 +2649,7 @@
           <w:sz w:val="22"/>
           <w:szCs w:val="22"/>
         </w:rPr>
-        <w:t xml:space="preserve">50% of gross cash revenue collected</w:t>
+        <w:t xml:space="preserve">2. Control isolation — RESOLVED by your charter.</w:t>
       </w:r>
       <w:r>
         <w:rPr>
@@ -2380,7 +2661,7 @@
           <w:sz w:val="22"/>
           <w:szCs w:val="22"/>
         </w:rPr>
-        <w:t xml:space="preserve"> (top-line, cash basis). Drafted accordingly. Note this pays investors before the Company covers its own costs — intentional per the one-pager, but cash-flow-intensive; keep an eye on it operationally.</w:t>
+        <w:t xml:space="preserve"> Only Norman holds Class B (10×); everyone else (founders + investors) holds Class A (1×); Class B auto-converts on transfer. Just issue accordingly and record it in the stock ledger and Stock Purchase Agreement.</w:t>
       </w:r>
     </w:p>
     <w:p>
@@ -2405,7 +2686,7 @@
           <w:sz w:val="22"/>
           <w:szCs w:val="22"/>
         </w:rPr>
-        <w:t xml:space="preserve">3. The additional $1.5M call.</w:t>
+        <w:t xml:space="preserve">3. Tranching (capital efficiency → retained equity).</w:t>
       </w:r>
       <w:r>
         <w:rPr>
@@ -2417,7 +2698,7 @@
           <w:sz w:val="22"/>
           <w:szCs w:val="22"/>
         </w:rPr>
-        <w:t xml:space="preserve"> "Callable on same terms" needs mechanics: does the second $1.5M add </w:t>
+        <w:t xml:space="preserve"> Returning undeployed cash alone (the Ankur right) does </w:t>
       </w:r>
       <w:r>
         <w:rPr>
@@ -2429,7 +2710,7 @@
           <w:sz w:val="22"/>
           <w:szCs w:val="22"/>
         </w:rPr>
-        <w:t xml:space="preserve">another 15%</w:t>
+        <w:t xml:space="preserve">not</w:t>
       </w:r>
       <w:r>
         <w:rPr>
@@ -2441,7 +2722,7 @@
           <w:sz w:val="22"/>
           <w:szCs w:val="22"/>
         </w:rPr>
-        <w:t xml:space="preserve"> (diluting founders to 70%), or convert at a new valuation? </w:t>
+        <w:t xml:space="preserve"> claw back equity. To give up less equity when you deploy less, size a </w:t>
       </w:r>
       <w:r>
         <w:rPr>
@@ -2453,21 +2734,20 @@
           <w:sz w:val="22"/>
           <w:szCs w:val="22"/>
         </w:rPr>
-        <w:t xml:space="preserve">[Specify.]</w:t>
-      </w:r>
-    </w:p>
-    <w:p>
-      <w:pPr>
-        <w:spacing w:after="60"/>
-      </w:pPr>
-      <w:r>
-        <w:t xml:space="preserve"/>
-      </w:r>
-    </w:p>
-    <w:p>
-      <w:pPr>
-        <w:spacing w:after="80"/>
-      </w:pPr>
+        <w:t xml:space="preserve">smaller first close with the remainder callable at the same valuation</w:t>
+      </w:r>
+      <w:r>
+        <w:rPr>
+          <w:rFonts w:ascii="Times New Roman" w:cs="Times New Roman" w:eastAsia="Times New Roman" w:hAnsi="Times New Roman"/>
+          <w:b w:val="false"/>
+          <w:bCs w:val="false"/>
+          <w:i w:val="false"/>
+          <w:iCs w:val="false"/>
+          <w:sz w:val="22"/>
+          <w:szCs w:val="22"/>
+        </w:rPr>
+        <w:t xml:space="preserve"> — issue shares only as capital is called. </w:t>
+      </w:r>
       <w:r>
         <w:rPr>
           <w:rFonts w:ascii="Times New Roman" w:cs="Times New Roman" w:eastAsia="Times New Roman" w:hAnsi="Times New Roman"/>
@@ -2478,6 +2758,31 @@
           <w:sz w:val="22"/>
           <w:szCs w:val="22"/>
         </w:rPr>
+        <w:t xml:space="preserve">[Decide first-close size.]</w:t>
+      </w:r>
+    </w:p>
+    <w:p>
+      <w:pPr>
+        <w:spacing w:after="60"/>
+      </w:pPr>
+      <w:r>
+        <w:t xml:space="preserve"/>
+      </w:r>
+    </w:p>
+    <w:p>
+      <w:pPr>
+        <w:spacing w:after="80"/>
+      </w:pPr>
+      <w:r>
+        <w:rPr>
+          <w:rFonts w:ascii="Times New Roman" w:cs="Times New Roman" w:eastAsia="Times New Roman" w:hAnsi="Times New Roman"/>
+          <w:b/>
+          <w:bCs/>
+          <w:i w:val="false"/>
+          <w:iCs w:val="false"/>
+          <w:sz w:val="22"/>
+          <w:szCs w:val="22"/>
+        </w:rPr>
         <w:t xml:space="preserve">Other flags:</w:t>
       </w:r>
       <w:r>
@@ -2490,7 +2795,7 @@
           <w:sz w:val="22"/>
           <w:szCs w:val="22"/>
         </w:rPr>
-        <w:t xml:space="preserve"> exact registered entity name/state; founder Class B split; the Ankur return-right standard (discretion vs. milestones) and its effect on units; drag/tag inclusion; venue/arbitration. Also: the one-pager still lists Norman &amp; Sunjay as "Co-Founder" and Ankur/Greg as "Strategic Advisor" — update the one-pager to the new titles (Founder &amp; CEO / Founding Partner) so it matches these docs.</w:t>
+        <w:t xml:space="preserve"> exact per-share price/share counts; founder share counts + vesting; the additional-$1.5M-call mechanics; drag/tag; venue/arbitration; the corp's tax reporting (1099s, not K-1s).</w:t>
       </w:r>
     </w:p>
     <w:p>

</xml_diff>